<commit_message>
Feat: Core dashboard stabilized on MySQL default port 3306
</commit_message>
<xml_diff>
--- a/ITC PROJECT LOGIC.docx
+++ b/ITC PROJECT LOGIC.docx
@@ -481,51 +481,7 @@
           <w:szCs w:val="24"/>
         </w:rPr>
         <w:lastRenderedPageBreak/>
-        <w:t>Fallback Forecast = Mean Daily Revenue</w:t>
-      </w:r>
-      <w:r>
-        <w:rPr>
-          <w:rFonts w:ascii="Calibri" w:hAnsi="Calibri" w:cs="Calibri"/>
-          <w:b/>
-          <w:bCs/>
-          <w:color w:val="002060"/>
-          <w:sz w:val="24"/>
-          <w:szCs w:val="24"/>
-        </w:rPr>
-        <w:t xml:space="preserve"> x</w:t>
-      </w:r>
-      <w:r>
-        <w:rPr>
-          <w:rFonts w:ascii="Calibri" w:hAnsi="Calibri" w:cs="Calibri"/>
-          <w:b/>
-          <w:bCs/>
-          <w:color w:val="002060"/>
-          <w:sz w:val="24"/>
-          <w:szCs w:val="24"/>
-        </w:rPr>
-        <w:t xml:space="preserve"> (M </w:t>
-      </w:r>
-      <w:r>
-        <w:rPr>
-          <w:rFonts w:ascii="Calibri" w:hAnsi="Calibri" w:cs="Calibri"/>
-          <w:b/>
-          <w:bCs/>
-          <w:color w:val="002060"/>
-          <w:sz w:val="24"/>
-          <w:szCs w:val="24"/>
-        </w:rPr>
-        <w:t>x</w:t>
-      </w:r>
-      <w:r>
-        <w:rPr>
-          <w:rFonts w:ascii="Calibri" w:hAnsi="Calibri" w:cs="Calibri"/>
-          <w:b/>
-          <w:bCs/>
-          <w:color w:val="002060"/>
-          <w:sz w:val="24"/>
-          <w:szCs w:val="24"/>
-        </w:rPr>
-        <w:t xml:space="preserve"> 30)</w:t>
+        <w:t>Fallback Forecast = Mean Daily Revenue x (M x 30)</w:t>
       </w:r>
     </w:p>
     <w:p/>
@@ -617,29 +573,7 @@
           <w:sz w:val="24"/>
           <w:szCs w:val="24"/>
         </w:rPr>
-        <w:t>Daily Sales Speed= sum(Quantity</w:t>
-      </w:r>
-      <w:r>
-        <w:rPr>
-          <w:rFonts w:ascii="Calibri" w:hAnsi="Calibri" w:cs="Calibri"/>
-          <w:b/>
-          <w:bCs/>
-          <w:color w:val="002060"/>
-          <w:sz w:val="24"/>
-          <w:szCs w:val="24"/>
-        </w:rPr>
-        <w:t xml:space="preserve">) / </w:t>
-      </w:r>
-      <w:r>
-        <w:rPr>
-          <w:rFonts w:ascii="Calibri" w:hAnsi="Calibri" w:cs="Calibri"/>
-          <w:b/>
-          <w:bCs/>
-          <w:color w:val="002060"/>
-          <w:sz w:val="24"/>
-          <w:szCs w:val="24"/>
-        </w:rPr>
-        <w:t xml:space="preserve">Total Operational Days Tracked ( </w:t>
+        <w:t xml:space="preserve">Daily Sales Speed= sum(Quantity) / Total Operational Days Tracked ( </w:t>
       </w:r>
       <w:proofErr w:type="spellStart"/>
       <w:r>
@@ -1103,6 +1037,747 @@
         <w:t>Total Volume Shift %)</w:t>
       </w:r>
     </w:p>
+    <w:p>
+      <w:pPr>
+        <w:rPr>
+          <w:b/>
+          <w:bCs/>
+          <w:sz w:val="24"/>
+          <w:szCs w:val="24"/>
+        </w:rPr>
+      </w:pPr>
+      <w:r>
+        <w:rPr>
+          <w:b/>
+          <w:bCs/>
+          <w:sz w:val="24"/>
+          <w:szCs w:val="24"/>
+        </w:rPr>
+        <w:lastRenderedPageBreak/>
+        <w:t xml:space="preserve">Project </w:t>
+      </w:r>
+      <w:r>
+        <w:rPr>
+          <w:b/>
+          <w:bCs/>
+          <w:sz w:val="24"/>
+          <w:szCs w:val="24"/>
+        </w:rPr>
+        <w:t>Plan</w:t>
+      </w:r>
+      <w:r>
+        <w:rPr>
+          <w:b/>
+          <w:bCs/>
+          <w:sz w:val="24"/>
+          <w:szCs w:val="24"/>
+        </w:rPr>
+        <w:t>: Transitioning to an API-Driven Architecture</w:t>
+      </w:r>
+    </w:p>
+    <w:p>
+      <w:pPr>
+        <w:rPr>
+          <w:sz w:val="24"/>
+          <w:szCs w:val="24"/>
+        </w:rPr>
+      </w:pPr>
+      <w:r>
+        <w:rPr>
+          <w:b/>
+          <w:bCs/>
+          <w:sz w:val="24"/>
+          <w:szCs w:val="24"/>
+        </w:rPr>
+        <w:t>Objective:</w:t>
+      </w:r>
+      <w:r>
+        <w:rPr>
+          <w:sz w:val="24"/>
+          <w:szCs w:val="24"/>
+        </w:rPr>
+        <w:t xml:space="preserve"> Separating the Web Storefront and Analytical Database using a Web API Bridge</w:t>
+      </w:r>
+    </w:p>
+    <w:p>
+      <w:pPr>
+        <w:rPr>
+          <w:b/>
+          <w:bCs/>
+          <w:sz w:val="24"/>
+          <w:szCs w:val="24"/>
+        </w:rPr>
+      </w:pPr>
+      <w:r>
+        <w:rPr>
+          <w:b/>
+          <w:bCs/>
+          <w:sz w:val="24"/>
+          <w:szCs w:val="24"/>
+        </w:rPr>
+        <w:t>1. Current Project Status &amp; Problem</w:t>
+      </w:r>
+    </w:p>
+    <w:p>
+      <w:pPr>
+        <w:rPr>
+          <w:sz w:val="24"/>
+          <w:szCs w:val="24"/>
+        </w:rPr>
+      </w:pPr>
+      <w:r>
+        <w:rPr>
+          <w:sz w:val="24"/>
+          <w:szCs w:val="24"/>
+        </w:rPr>
+        <w:t>Right now, our dashboard connects directly to our MySQL database to read sales numbers. In a real-world company system, connecting a user website directly to a private database is a security risk and can slow down the system.</w:t>
+      </w:r>
+    </w:p>
+    <w:p>
+      <w:pPr>
+        <w:rPr>
+          <w:sz w:val="24"/>
+          <w:szCs w:val="24"/>
+        </w:rPr>
+      </w:pPr>
+      <w:r>
+        <w:rPr>
+          <w:sz w:val="24"/>
+          <w:szCs w:val="24"/>
+        </w:rPr>
+        <w:t xml:space="preserve">To make our project professional, secure, and fast, we need to move to a </w:t>
+      </w:r>
+      <w:r>
+        <w:rPr>
+          <w:b/>
+          <w:bCs/>
+          <w:sz w:val="24"/>
+          <w:szCs w:val="24"/>
+        </w:rPr>
+        <w:t>3-Layer System</w:t>
+      </w:r>
+      <w:r>
+        <w:rPr>
+          <w:sz w:val="24"/>
+          <w:szCs w:val="24"/>
+        </w:rPr>
+        <w:t xml:space="preserve">. This layout separates our database from what the user sees, using a </w:t>
+      </w:r>
+      <w:r>
+        <w:rPr>
+          <w:b/>
+          <w:bCs/>
+          <w:sz w:val="24"/>
+          <w:szCs w:val="24"/>
+        </w:rPr>
+        <w:t>Web API</w:t>
+      </w:r>
+      <w:r>
+        <w:rPr>
+          <w:sz w:val="24"/>
+          <w:szCs w:val="24"/>
+        </w:rPr>
+        <w:t xml:space="preserve"> as a middle messenger.</w:t>
+      </w:r>
+    </w:p>
+    <w:p>
+      <w:pPr>
+        <w:rPr>
+          <w:b/>
+          <w:bCs/>
+          <w:sz w:val="24"/>
+          <w:szCs w:val="24"/>
+        </w:rPr>
+      </w:pPr>
+      <w:r>
+        <w:rPr>
+          <w:b/>
+          <w:bCs/>
+          <w:sz w:val="24"/>
+          <w:szCs w:val="24"/>
+        </w:rPr>
+        <w:t>2. The Proposed 3-Layer Architecture</w:t>
+      </w:r>
+    </w:p>
+    <w:p>
+      <w:pPr>
+        <w:numPr>
+          <w:ilvl w:val="0"/>
+          <w:numId w:val="6"/>
+        </w:numPr>
+        <w:rPr>
+          <w:sz w:val="24"/>
+          <w:szCs w:val="24"/>
+        </w:rPr>
+      </w:pPr>
+      <w:r>
+        <w:rPr>
+          <w:b/>
+          <w:bCs/>
+          <w:sz w:val="24"/>
+          <w:szCs w:val="24"/>
+        </w:rPr>
+        <w:t>Layer 1: The Front-End Layer (E-Commerce Web Portal)</w:t>
+      </w:r>
+    </w:p>
+    <w:p>
+      <w:pPr>
+        <w:numPr>
+          <w:ilvl w:val="1"/>
+          <w:numId w:val="6"/>
+        </w:numPr>
+        <w:rPr>
+          <w:sz w:val="24"/>
+          <w:szCs w:val="24"/>
+        </w:rPr>
+      </w:pPr>
+      <w:r>
+        <w:rPr>
+          <w:b/>
+          <w:bCs/>
+          <w:sz w:val="24"/>
+          <w:szCs w:val="24"/>
+        </w:rPr>
+        <w:t>What it represents:</w:t>
+      </w:r>
+      <w:r>
+        <w:rPr>
+          <w:sz w:val="24"/>
+          <w:szCs w:val="24"/>
+        </w:rPr>
+        <w:t xml:space="preserve"> The user-facing online store website.</w:t>
+      </w:r>
+    </w:p>
+    <w:p>
+      <w:pPr>
+        <w:numPr>
+          <w:ilvl w:val="1"/>
+          <w:numId w:val="6"/>
+        </w:numPr>
+        <w:rPr>
+          <w:sz w:val="24"/>
+          <w:szCs w:val="24"/>
+        </w:rPr>
+      </w:pPr>
+      <w:r>
+        <w:rPr>
+          <w:b/>
+          <w:bCs/>
+          <w:sz w:val="24"/>
+          <w:szCs w:val="24"/>
+        </w:rPr>
+        <w:t>Action:</w:t>
+      </w:r>
+      <w:r>
+        <w:rPr>
+          <w:sz w:val="24"/>
+          <w:szCs w:val="24"/>
+        </w:rPr>
+        <w:t xml:space="preserve"> A customer visits the store (like a mock Amazon page) and clicks "Buy" on a product.</w:t>
+      </w:r>
+    </w:p>
+    <w:p>
+      <w:pPr>
+        <w:numPr>
+          <w:ilvl w:val="1"/>
+          <w:numId w:val="6"/>
+        </w:numPr>
+        <w:rPr>
+          <w:sz w:val="24"/>
+          <w:szCs w:val="24"/>
+        </w:rPr>
+      </w:pPr>
+      <w:r>
+        <w:rPr>
+          <w:b/>
+          <w:bCs/>
+          <w:sz w:val="24"/>
+          <w:szCs w:val="24"/>
+        </w:rPr>
+        <w:t>Result:</w:t>
+      </w:r>
+      <w:r>
+        <w:rPr>
+          <w:sz w:val="24"/>
+          <w:szCs w:val="24"/>
+        </w:rPr>
+        <w:t xml:space="preserve"> The portal automatically creates a digital receipt or invoice record for that order.</w:t>
+      </w:r>
+    </w:p>
+    <w:p>
+      <w:pPr>
+        <w:numPr>
+          <w:ilvl w:val="0"/>
+          <w:numId w:val="6"/>
+        </w:numPr>
+        <w:rPr>
+          <w:sz w:val="24"/>
+          <w:szCs w:val="24"/>
+        </w:rPr>
+      </w:pPr>
+      <w:r>
+        <w:rPr>
+          <w:b/>
+          <w:bCs/>
+          <w:sz w:val="24"/>
+          <w:szCs w:val="24"/>
+        </w:rPr>
+        <w:t>Layer 2: The Middle Layer (The Web API Messenger)</w:t>
+      </w:r>
+    </w:p>
+    <w:p>
+      <w:pPr>
+        <w:numPr>
+          <w:ilvl w:val="1"/>
+          <w:numId w:val="6"/>
+        </w:numPr>
+        <w:rPr>
+          <w:sz w:val="24"/>
+          <w:szCs w:val="24"/>
+        </w:rPr>
+      </w:pPr>
+      <w:r>
+        <w:rPr>
+          <w:b/>
+          <w:bCs/>
+          <w:sz w:val="24"/>
+          <w:szCs w:val="24"/>
+        </w:rPr>
+        <w:t>What it represents:</w:t>
+      </w:r>
+      <w:r>
+        <w:rPr>
+          <w:sz w:val="24"/>
+          <w:szCs w:val="24"/>
+        </w:rPr>
+        <w:t xml:space="preserve"> A secure bridge that sits between the website storefront and our private database.</w:t>
+      </w:r>
+    </w:p>
+    <w:p>
+      <w:pPr>
+        <w:numPr>
+          <w:ilvl w:val="1"/>
+          <w:numId w:val="6"/>
+        </w:numPr>
+        <w:rPr>
+          <w:sz w:val="24"/>
+          <w:szCs w:val="24"/>
+        </w:rPr>
+      </w:pPr>
+      <w:r>
+        <w:rPr>
+          <w:b/>
+          <w:bCs/>
+          <w:sz w:val="24"/>
+          <w:szCs w:val="24"/>
+        </w:rPr>
+        <w:t>Action:</w:t>
+      </w:r>
+      <w:r>
+        <w:rPr>
+          <w:sz w:val="24"/>
+          <w:szCs w:val="24"/>
+        </w:rPr>
+        <w:t xml:space="preserve"> It takes the data from the website receipt, cleans it, and packs it into a standard text format called </w:t>
+      </w:r>
+      <w:r>
+        <w:rPr>
+          <w:b/>
+          <w:bCs/>
+          <w:sz w:val="24"/>
+          <w:szCs w:val="24"/>
+        </w:rPr>
+        <w:t>JSON</w:t>
+      </w:r>
+      <w:r>
+        <w:rPr>
+          <w:sz w:val="24"/>
+          <w:szCs w:val="24"/>
+        </w:rPr>
+        <w:t>.</w:t>
+      </w:r>
+    </w:p>
+    <w:p>
+      <w:pPr>
+        <w:numPr>
+          <w:ilvl w:val="1"/>
+          <w:numId w:val="6"/>
+        </w:numPr>
+        <w:rPr>
+          <w:sz w:val="24"/>
+          <w:szCs w:val="24"/>
+        </w:rPr>
+      </w:pPr>
+      <w:r>
+        <w:rPr>
+          <w:b/>
+          <w:bCs/>
+          <w:sz w:val="24"/>
+          <w:szCs w:val="24"/>
+        </w:rPr>
+        <w:t>Result:</w:t>
+      </w:r>
+      <w:r>
+        <w:rPr>
+          <w:sz w:val="24"/>
+          <w:szCs w:val="24"/>
+        </w:rPr>
+        <w:t xml:space="preserve"> It consumes the client-side data and securely passes it down to our backend database.</w:t>
+      </w:r>
+    </w:p>
+    <w:p>
+      <w:pPr>
+        <w:numPr>
+          <w:ilvl w:val="0"/>
+          <w:numId w:val="6"/>
+        </w:numPr>
+        <w:rPr>
+          <w:sz w:val="24"/>
+          <w:szCs w:val="24"/>
+        </w:rPr>
+      </w:pPr>
+      <w:r>
+        <w:rPr>
+          <w:b/>
+          <w:bCs/>
+          <w:sz w:val="24"/>
+          <w:szCs w:val="24"/>
+        </w:rPr>
+        <w:t xml:space="preserve">Layer 3: The Backend Layer (Analytical DB &amp; ETL) — </w:t>
+      </w:r>
+      <w:r>
+        <w:rPr>
+          <w:b/>
+          <w:bCs/>
+          <w:i/>
+          <w:iCs/>
+          <w:sz w:val="24"/>
+          <w:szCs w:val="24"/>
+        </w:rPr>
+        <w:t>Our Current Project</w:t>
+      </w:r>
+    </w:p>
+    <w:p>
+      <w:pPr>
+        <w:numPr>
+          <w:ilvl w:val="1"/>
+          <w:numId w:val="6"/>
+        </w:numPr>
+        <w:rPr>
+          <w:sz w:val="24"/>
+          <w:szCs w:val="24"/>
+        </w:rPr>
+      </w:pPr>
+      <w:r>
+        <w:rPr>
+          <w:b/>
+          <w:bCs/>
+          <w:sz w:val="24"/>
+          <w:szCs w:val="24"/>
+        </w:rPr>
+        <w:t>What it represents:</w:t>
+      </w:r>
+      <w:r>
+        <w:rPr>
+          <w:sz w:val="24"/>
+          <w:szCs w:val="24"/>
+        </w:rPr>
+        <w:t xml:space="preserve"> Our core MySQL database where our sales history lives.</w:t>
+      </w:r>
+    </w:p>
+    <w:p>
+      <w:pPr>
+        <w:numPr>
+          <w:ilvl w:val="1"/>
+          <w:numId w:val="6"/>
+        </w:numPr>
+        <w:rPr>
+          <w:sz w:val="24"/>
+          <w:szCs w:val="24"/>
+        </w:rPr>
+      </w:pPr>
+      <w:r>
+        <w:rPr>
+          <w:b/>
+          <w:bCs/>
+          <w:sz w:val="24"/>
+          <w:szCs w:val="24"/>
+        </w:rPr>
+        <w:t>Action:</w:t>
+      </w:r>
+      <w:r>
+        <w:rPr>
+          <w:sz w:val="24"/>
+          <w:szCs w:val="24"/>
+        </w:rPr>
+        <w:t xml:space="preserve"> It catches the incoming JSON data from the API messenger and saves it permanently into our tables.</w:t>
+      </w:r>
+    </w:p>
+    <w:p>
+      <w:pPr>
+        <w:numPr>
+          <w:ilvl w:val="1"/>
+          <w:numId w:val="6"/>
+        </w:numPr>
+        <w:rPr>
+          <w:sz w:val="24"/>
+          <w:szCs w:val="24"/>
+        </w:rPr>
+      </w:pPr>
+      <w:r>
+        <w:rPr>
+          <w:b/>
+          <w:bCs/>
+          <w:sz w:val="24"/>
+          <w:szCs w:val="24"/>
+        </w:rPr>
+        <w:t>Result:</w:t>
+      </w:r>
+      <w:r>
+        <w:rPr>
+          <w:sz w:val="24"/>
+          <w:szCs w:val="24"/>
+        </w:rPr>
+        <w:t xml:space="preserve"> Our dashboard uses this data to update all the live sales charts and trends.</w:t>
+      </w:r>
+    </w:p>
+    <w:p>
+      <w:pPr>
+        <w:rPr>
+          <w:b/>
+          <w:bCs/>
+          <w:sz w:val="24"/>
+          <w:szCs w:val="24"/>
+        </w:rPr>
+      </w:pPr>
+      <w:r>
+        <w:rPr>
+          <w:b/>
+          <w:bCs/>
+          <w:sz w:val="24"/>
+          <w:szCs w:val="24"/>
+        </w:rPr>
+        <w:t>3. Implementation Roadmap (Our TO-DO List)</w:t>
+      </w:r>
+    </w:p>
+    <w:p>
+      <w:pPr>
+        <w:rPr>
+          <w:sz w:val="24"/>
+          <w:szCs w:val="24"/>
+        </w:rPr>
+      </w:pPr>
+      <w:r>
+        <w:rPr>
+          <w:sz w:val="24"/>
+          <w:szCs w:val="24"/>
+        </w:rPr>
+        <w:t>To build this architecture, I plan to complete the following two tasks:</w:t>
+      </w:r>
+    </w:p>
+    <w:p>
+      <w:pPr>
+        <w:rPr>
+          <w:b/>
+          <w:bCs/>
+          <w:sz w:val="24"/>
+          <w:szCs w:val="24"/>
+        </w:rPr>
+      </w:pPr>
+      <w:r>
+        <w:rPr>
+          <w:b/>
+          <w:bCs/>
+          <w:sz w:val="24"/>
+          <w:szCs w:val="24"/>
+        </w:rPr>
+        <w:t>Task A: Build the Web API (Backend Extension)</w:t>
+      </w:r>
+    </w:p>
+    <w:p>
+      <w:pPr>
+        <w:numPr>
+          <w:ilvl w:val="0"/>
+          <w:numId w:val="7"/>
+        </w:numPr>
+        <w:rPr>
+          <w:sz w:val="24"/>
+          <w:szCs w:val="24"/>
+        </w:rPr>
+      </w:pPr>
+      <w:r>
+        <w:rPr>
+          <w:b/>
+          <w:bCs/>
+          <w:sz w:val="24"/>
+          <w:szCs w:val="24"/>
+        </w:rPr>
+        <w:lastRenderedPageBreak/>
+        <w:t>Plan:</w:t>
+      </w:r>
+      <w:r>
+        <w:rPr>
+          <w:sz w:val="24"/>
+          <w:szCs w:val="24"/>
+        </w:rPr>
+        <w:t xml:space="preserve"> I will use a simple Python tool like </w:t>
+      </w:r>
+      <w:proofErr w:type="spellStart"/>
+      <w:r>
+        <w:rPr>
+          <w:b/>
+          <w:bCs/>
+          <w:sz w:val="24"/>
+          <w:szCs w:val="24"/>
+        </w:rPr>
+        <w:t>FastAPI</w:t>
+      </w:r>
+      <w:proofErr w:type="spellEnd"/>
+      <w:r>
+        <w:rPr>
+          <w:sz w:val="24"/>
+          <w:szCs w:val="24"/>
+        </w:rPr>
+        <w:t xml:space="preserve"> or </w:t>
+      </w:r>
+      <w:r>
+        <w:rPr>
+          <w:b/>
+          <w:bCs/>
+          <w:sz w:val="24"/>
+          <w:szCs w:val="24"/>
+        </w:rPr>
+        <w:t>Flask</w:t>
+      </w:r>
+      <w:r>
+        <w:rPr>
+          <w:sz w:val="24"/>
+          <w:szCs w:val="24"/>
+        </w:rPr>
+        <w:t xml:space="preserve"> to build the secure middleware messenger.</w:t>
+      </w:r>
+    </w:p>
+    <w:p>
+      <w:pPr>
+        <w:numPr>
+          <w:ilvl w:val="0"/>
+          <w:numId w:val="7"/>
+        </w:numPr>
+        <w:rPr>
+          <w:sz w:val="24"/>
+          <w:szCs w:val="24"/>
+        </w:rPr>
+      </w:pPr>
+      <w:r>
+        <w:rPr>
+          <w:b/>
+          <w:bCs/>
+          <w:sz w:val="24"/>
+          <w:szCs w:val="24"/>
+        </w:rPr>
+        <w:t>Process:</w:t>
+      </w:r>
+      <w:r>
+        <w:rPr>
+          <w:sz w:val="24"/>
+          <w:szCs w:val="24"/>
+        </w:rPr>
+        <w:t xml:space="preserve"> Instead of our </w:t>
+      </w:r>
+      <w:proofErr w:type="spellStart"/>
+      <w:r>
+        <w:rPr>
+          <w:sz w:val="24"/>
+          <w:szCs w:val="24"/>
+        </w:rPr>
+        <w:t>Streamlit</w:t>
+      </w:r>
+      <w:proofErr w:type="spellEnd"/>
+      <w:r>
+        <w:rPr>
+          <w:sz w:val="24"/>
+          <w:szCs w:val="24"/>
+        </w:rPr>
+        <w:t xml:space="preserve"> dashboard querying the database directly, it will make a web request to this new API, and the API will return the data safely as a JSON file.</w:t>
+      </w:r>
+    </w:p>
+    <w:p>
+      <w:pPr>
+        <w:rPr>
+          <w:b/>
+          <w:bCs/>
+          <w:sz w:val="24"/>
+          <w:szCs w:val="24"/>
+        </w:rPr>
+      </w:pPr>
+      <w:r>
+        <w:rPr>
+          <w:b/>
+          <w:bCs/>
+          <w:sz w:val="24"/>
+          <w:szCs w:val="24"/>
+        </w:rPr>
+        <w:t>Task B: Create the E-Commerce Web Portal Simulator (Frontend)</w:t>
+      </w:r>
+    </w:p>
+    <w:p>
+      <w:pPr>
+        <w:numPr>
+          <w:ilvl w:val="0"/>
+          <w:numId w:val="8"/>
+        </w:numPr>
+        <w:rPr>
+          <w:sz w:val="24"/>
+          <w:szCs w:val="24"/>
+        </w:rPr>
+      </w:pPr>
+      <w:r>
+        <w:rPr>
+          <w:b/>
+          <w:bCs/>
+          <w:sz w:val="24"/>
+          <w:szCs w:val="24"/>
+        </w:rPr>
+        <w:t>Plan:</w:t>
+      </w:r>
+      <w:r>
+        <w:rPr>
+          <w:sz w:val="24"/>
+          <w:szCs w:val="24"/>
+        </w:rPr>
+        <w:t xml:space="preserve"> I will build a simple "checkout page" inside our app with an interactive order form.</w:t>
+      </w:r>
+    </w:p>
+    <w:p>
+      <w:pPr>
+        <w:numPr>
+          <w:ilvl w:val="0"/>
+          <w:numId w:val="8"/>
+        </w:numPr>
+        <w:rPr>
+          <w:sz w:val="24"/>
+          <w:szCs w:val="24"/>
+        </w:rPr>
+      </w:pPr>
+      <w:r>
+        <w:rPr>
+          <w:b/>
+          <w:bCs/>
+          <w:sz w:val="24"/>
+          <w:szCs w:val="24"/>
+        </w:rPr>
+        <w:t>Process:</w:t>
+      </w:r>
+      <w:r>
+        <w:rPr>
+          <w:sz w:val="24"/>
+          <w:szCs w:val="24"/>
+        </w:rPr>
+        <w:t xml:space="preserve"> An operator can type in a test order (for example: 5 units of Fiama Gel Bar) and click submit. This submission will hit our new API, add the row to our MySQL database, and instantly update our analytics charts.</w:t>
+      </w:r>
+    </w:p>
+    <w:p/>
+    <w:p/>
     <w:sectPr>
       <w:pgSz w:w="11906" w:h="16838"/>
       <w:pgMar w:top="1440" w:right="1440" w:bottom="1440" w:left="1440" w:header="708" w:footer="708" w:gutter="0"/>
@@ -1527,6 +2202,155 @@
     </w:lvl>
   </w:abstractNum>
   <w:abstractNum w:abstractNumId="3" w15:restartNumberingAfterBreak="0">
+    <w:nsid w:val="168A733E"/>
+    <w:multiLevelType w:val="multilevel"/>
+    <w:tmpl w:val="C660FC4E"/>
+    <w:lvl w:ilvl="0">
+      <w:start w:val="1"/>
+      <w:numFmt w:val="bullet"/>
+      <w:lvlText w:val=""/>
+      <w:lvlJc w:val="left"/>
+      <w:pPr>
+        <w:tabs>
+          <w:tab w:val="num" w:pos="720"/>
+        </w:tabs>
+        <w:ind w:left="720" w:hanging="360"/>
+      </w:pPr>
+      <w:rPr>
+        <w:rFonts w:ascii="Symbol" w:hAnsi="Symbol" w:hint="default"/>
+        <w:sz w:val="20"/>
+      </w:rPr>
+    </w:lvl>
+    <w:lvl w:ilvl="1" w:tentative="1">
+      <w:start w:val="1"/>
+      <w:numFmt w:val="bullet"/>
+      <w:lvlText w:val="o"/>
+      <w:lvlJc w:val="left"/>
+      <w:pPr>
+        <w:tabs>
+          <w:tab w:val="num" w:pos="1440"/>
+        </w:tabs>
+        <w:ind w:left="1440" w:hanging="360"/>
+      </w:pPr>
+      <w:rPr>
+        <w:rFonts w:ascii="Courier New" w:hAnsi="Courier New" w:hint="default"/>
+        <w:sz w:val="20"/>
+      </w:rPr>
+    </w:lvl>
+    <w:lvl w:ilvl="2" w:tentative="1">
+      <w:start w:val="1"/>
+      <w:numFmt w:val="bullet"/>
+      <w:lvlText w:val=""/>
+      <w:lvlJc w:val="left"/>
+      <w:pPr>
+        <w:tabs>
+          <w:tab w:val="num" w:pos="2160"/>
+        </w:tabs>
+        <w:ind w:left="2160" w:hanging="360"/>
+      </w:pPr>
+      <w:rPr>
+        <w:rFonts w:ascii="Wingdings" w:hAnsi="Wingdings" w:hint="default"/>
+        <w:sz w:val="20"/>
+      </w:rPr>
+    </w:lvl>
+    <w:lvl w:ilvl="3" w:tentative="1">
+      <w:start w:val="1"/>
+      <w:numFmt w:val="bullet"/>
+      <w:lvlText w:val=""/>
+      <w:lvlJc w:val="left"/>
+      <w:pPr>
+        <w:tabs>
+          <w:tab w:val="num" w:pos="2880"/>
+        </w:tabs>
+        <w:ind w:left="2880" w:hanging="360"/>
+      </w:pPr>
+      <w:rPr>
+        <w:rFonts w:ascii="Wingdings" w:hAnsi="Wingdings" w:hint="default"/>
+        <w:sz w:val="20"/>
+      </w:rPr>
+    </w:lvl>
+    <w:lvl w:ilvl="4" w:tentative="1">
+      <w:start w:val="1"/>
+      <w:numFmt w:val="bullet"/>
+      <w:lvlText w:val=""/>
+      <w:lvlJc w:val="left"/>
+      <w:pPr>
+        <w:tabs>
+          <w:tab w:val="num" w:pos="3600"/>
+        </w:tabs>
+        <w:ind w:left="3600" w:hanging="360"/>
+      </w:pPr>
+      <w:rPr>
+        <w:rFonts w:ascii="Wingdings" w:hAnsi="Wingdings" w:hint="default"/>
+        <w:sz w:val="20"/>
+      </w:rPr>
+    </w:lvl>
+    <w:lvl w:ilvl="5" w:tentative="1">
+      <w:start w:val="1"/>
+      <w:numFmt w:val="bullet"/>
+      <w:lvlText w:val=""/>
+      <w:lvlJc w:val="left"/>
+      <w:pPr>
+        <w:tabs>
+          <w:tab w:val="num" w:pos="4320"/>
+        </w:tabs>
+        <w:ind w:left="4320" w:hanging="360"/>
+      </w:pPr>
+      <w:rPr>
+        <w:rFonts w:ascii="Wingdings" w:hAnsi="Wingdings" w:hint="default"/>
+        <w:sz w:val="20"/>
+      </w:rPr>
+    </w:lvl>
+    <w:lvl w:ilvl="6" w:tentative="1">
+      <w:start w:val="1"/>
+      <w:numFmt w:val="bullet"/>
+      <w:lvlText w:val=""/>
+      <w:lvlJc w:val="left"/>
+      <w:pPr>
+        <w:tabs>
+          <w:tab w:val="num" w:pos="5040"/>
+        </w:tabs>
+        <w:ind w:left="5040" w:hanging="360"/>
+      </w:pPr>
+      <w:rPr>
+        <w:rFonts w:ascii="Wingdings" w:hAnsi="Wingdings" w:hint="default"/>
+        <w:sz w:val="20"/>
+      </w:rPr>
+    </w:lvl>
+    <w:lvl w:ilvl="7" w:tentative="1">
+      <w:start w:val="1"/>
+      <w:numFmt w:val="bullet"/>
+      <w:lvlText w:val=""/>
+      <w:lvlJc w:val="left"/>
+      <w:pPr>
+        <w:tabs>
+          <w:tab w:val="num" w:pos="5760"/>
+        </w:tabs>
+        <w:ind w:left="5760" w:hanging="360"/>
+      </w:pPr>
+      <w:rPr>
+        <w:rFonts w:ascii="Wingdings" w:hAnsi="Wingdings" w:hint="default"/>
+        <w:sz w:val="20"/>
+      </w:rPr>
+    </w:lvl>
+    <w:lvl w:ilvl="8" w:tentative="1">
+      <w:start w:val="1"/>
+      <w:numFmt w:val="bullet"/>
+      <w:lvlText w:val=""/>
+      <w:lvlJc w:val="left"/>
+      <w:pPr>
+        <w:tabs>
+          <w:tab w:val="num" w:pos="6480"/>
+        </w:tabs>
+        <w:ind w:left="6480" w:hanging="360"/>
+      </w:pPr>
+      <w:rPr>
+        <w:rFonts w:ascii="Wingdings" w:hAnsi="Wingdings" w:hint="default"/>
+        <w:sz w:val="20"/>
+      </w:rPr>
+    </w:lvl>
+  </w:abstractNum>
+  <w:abstractNum w:abstractNumId="4" w15:restartNumberingAfterBreak="0">
     <w:nsid w:val="347705D0"/>
     <w:multiLevelType w:val="multilevel"/>
     <w:tmpl w:val="4BD6C7F0"/>
@@ -1671,10 +2495,308 @@
       </w:rPr>
     </w:lvl>
   </w:abstractNum>
-  <w:abstractNum w:abstractNumId="4" w15:restartNumberingAfterBreak="0">
+  <w:abstractNum w:abstractNumId="5" w15:restartNumberingAfterBreak="0">
+    <w:nsid w:val="43886FE3"/>
+    <w:multiLevelType w:val="multilevel"/>
+    <w:tmpl w:val="2FEE1106"/>
+    <w:lvl w:ilvl="0">
+      <w:start w:val="1"/>
+      <w:numFmt w:val="bullet"/>
+      <w:lvlText w:val=""/>
+      <w:lvlJc w:val="left"/>
+      <w:pPr>
+        <w:tabs>
+          <w:tab w:val="num" w:pos="720"/>
+        </w:tabs>
+        <w:ind w:left="720" w:hanging="360"/>
+      </w:pPr>
+      <w:rPr>
+        <w:rFonts w:ascii="Symbol" w:hAnsi="Symbol" w:hint="default"/>
+        <w:sz w:val="20"/>
+      </w:rPr>
+    </w:lvl>
+    <w:lvl w:ilvl="1">
+      <w:start w:val="1"/>
+      <w:numFmt w:val="bullet"/>
+      <w:lvlText w:val="o"/>
+      <w:lvlJc w:val="left"/>
+      <w:pPr>
+        <w:tabs>
+          <w:tab w:val="num" w:pos="1440"/>
+        </w:tabs>
+        <w:ind w:left="1440" w:hanging="360"/>
+      </w:pPr>
+      <w:rPr>
+        <w:rFonts w:ascii="Courier New" w:hAnsi="Courier New" w:hint="default"/>
+        <w:sz w:val="20"/>
+      </w:rPr>
+    </w:lvl>
+    <w:lvl w:ilvl="2" w:tentative="1">
+      <w:start w:val="1"/>
+      <w:numFmt w:val="bullet"/>
+      <w:lvlText w:val=""/>
+      <w:lvlJc w:val="left"/>
+      <w:pPr>
+        <w:tabs>
+          <w:tab w:val="num" w:pos="2160"/>
+        </w:tabs>
+        <w:ind w:left="2160" w:hanging="360"/>
+      </w:pPr>
+      <w:rPr>
+        <w:rFonts w:ascii="Wingdings" w:hAnsi="Wingdings" w:hint="default"/>
+        <w:sz w:val="20"/>
+      </w:rPr>
+    </w:lvl>
+    <w:lvl w:ilvl="3" w:tentative="1">
+      <w:start w:val="1"/>
+      <w:numFmt w:val="bullet"/>
+      <w:lvlText w:val=""/>
+      <w:lvlJc w:val="left"/>
+      <w:pPr>
+        <w:tabs>
+          <w:tab w:val="num" w:pos="2880"/>
+        </w:tabs>
+        <w:ind w:left="2880" w:hanging="360"/>
+      </w:pPr>
+      <w:rPr>
+        <w:rFonts w:ascii="Wingdings" w:hAnsi="Wingdings" w:hint="default"/>
+        <w:sz w:val="20"/>
+      </w:rPr>
+    </w:lvl>
+    <w:lvl w:ilvl="4" w:tentative="1">
+      <w:start w:val="1"/>
+      <w:numFmt w:val="bullet"/>
+      <w:lvlText w:val=""/>
+      <w:lvlJc w:val="left"/>
+      <w:pPr>
+        <w:tabs>
+          <w:tab w:val="num" w:pos="3600"/>
+        </w:tabs>
+        <w:ind w:left="3600" w:hanging="360"/>
+      </w:pPr>
+      <w:rPr>
+        <w:rFonts w:ascii="Wingdings" w:hAnsi="Wingdings" w:hint="default"/>
+        <w:sz w:val="20"/>
+      </w:rPr>
+    </w:lvl>
+    <w:lvl w:ilvl="5" w:tentative="1">
+      <w:start w:val="1"/>
+      <w:numFmt w:val="bullet"/>
+      <w:lvlText w:val=""/>
+      <w:lvlJc w:val="left"/>
+      <w:pPr>
+        <w:tabs>
+          <w:tab w:val="num" w:pos="4320"/>
+        </w:tabs>
+        <w:ind w:left="4320" w:hanging="360"/>
+      </w:pPr>
+      <w:rPr>
+        <w:rFonts w:ascii="Wingdings" w:hAnsi="Wingdings" w:hint="default"/>
+        <w:sz w:val="20"/>
+      </w:rPr>
+    </w:lvl>
+    <w:lvl w:ilvl="6" w:tentative="1">
+      <w:start w:val="1"/>
+      <w:numFmt w:val="bullet"/>
+      <w:lvlText w:val=""/>
+      <w:lvlJc w:val="left"/>
+      <w:pPr>
+        <w:tabs>
+          <w:tab w:val="num" w:pos="5040"/>
+        </w:tabs>
+        <w:ind w:left="5040" w:hanging="360"/>
+      </w:pPr>
+      <w:rPr>
+        <w:rFonts w:ascii="Wingdings" w:hAnsi="Wingdings" w:hint="default"/>
+        <w:sz w:val="20"/>
+      </w:rPr>
+    </w:lvl>
+    <w:lvl w:ilvl="7" w:tentative="1">
+      <w:start w:val="1"/>
+      <w:numFmt w:val="bullet"/>
+      <w:lvlText w:val=""/>
+      <w:lvlJc w:val="left"/>
+      <w:pPr>
+        <w:tabs>
+          <w:tab w:val="num" w:pos="5760"/>
+        </w:tabs>
+        <w:ind w:left="5760" w:hanging="360"/>
+      </w:pPr>
+      <w:rPr>
+        <w:rFonts w:ascii="Wingdings" w:hAnsi="Wingdings" w:hint="default"/>
+        <w:sz w:val="20"/>
+      </w:rPr>
+    </w:lvl>
+    <w:lvl w:ilvl="8" w:tentative="1">
+      <w:start w:val="1"/>
+      <w:numFmt w:val="bullet"/>
+      <w:lvlText w:val=""/>
+      <w:lvlJc w:val="left"/>
+      <w:pPr>
+        <w:tabs>
+          <w:tab w:val="num" w:pos="6480"/>
+        </w:tabs>
+        <w:ind w:left="6480" w:hanging="360"/>
+      </w:pPr>
+      <w:rPr>
+        <w:rFonts w:ascii="Wingdings" w:hAnsi="Wingdings" w:hint="default"/>
+        <w:sz w:val="20"/>
+      </w:rPr>
+    </w:lvl>
+  </w:abstractNum>
+  <w:abstractNum w:abstractNumId="6" w15:restartNumberingAfterBreak="0">
     <w:nsid w:val="4E5D1262"/>
     <w:multiLevelType w:val="multilevel"/>
     <w:tmpl w:val="B87A8FB8"/>
+    <w:lvl w:ilvl="0">
+      <w:start w:val="1"/>
+      <w:numFmt w:val="bullet"/>
+      <w:lvlText w:val=""/>
+      <w:lvlJc w:val="left"/>
+      <w:pPr>
+        <w:tabs>
+          <w:tab w:val="num" w:pos="720"/>
+        </w:tabs>
+        <w:ind w:left="720" w:hanging="360"/>
+      </w:pPr>
+      <w:rPr>
+        <w:rFonts w:ascii="Symbol" w:hAnsi="Symbol" w:hint="default"/>
+        <w:sz w:val="20"/>
+      </w:rPr>
+    </w:lvl>
+    <w:lvl w:ilvl="1" w:tentative="1">
+      <w:start w:val="1"/>
+      <w:numFmt w:val="bullet"/>
+      <w:lvlText w:val="o"/>
+      <w:lvlJc w:val="left"/>
+      <w:pPr>
+        <w:tabs>
+          <w:tab w:val="num" w:pos="1440"/>
+        </w:tabs>
+        <w:ind w:left="1440" w:hanging="360"/>
+      </w:pPr>
+      <w:rPr>
+        <w:rFonts w:ascii="Courier New" w:hAnsi="Courier New" w:hint="default"/>
+        <w:sz w:val="20"/>
+      </w:rPr>
+    </w:lvl>
+    <w:lvl w:ilvl="2" w:tentative="1">
+      <w:start w:val="1"/>
+      <w:numFmt w:val="bullet"/>
+      <w:lvlText w:val=""/>
+      <w:lvlJc w:val="left"/>
+      <w:pPr>
+        <w:tabs>
+          <w:tab w:val="num" w:pos="2160"/>
+        </w:tabs>
+        <w:ind w:left="2160" w:hanging="360"/>
+      </w:pPr>
+      <w:rPr>
+        <w:rFonts w:ascii="Wingdings" w:hAnsi="Wingdings" w:hint="default"/>
+        <w:sz w:val="20"/>
+      </w:rPr>
+    </w:lvl>
+    <w:lvl w:ilvl="3" w:tentative="1">
+      <w:start w:val="1"/>
+      <w:numFmt w:val="bullet"/>
+      <w:lvlText w:val=""/>
+      <w:lvlJc w:val="left"/>
+      <w:pPr>
+        <w:tabs>
+          <w:tab w:val="num" w:pos="2880"/>
+        </w:tabs>
+        <w:ind w:left="2880" w:hanging="360"/>
+      </w:pPr>
+      <w:rPr>
+        <w:rFonts w:ascii="Wingdings" w:hAnsi="Wingdings" w:hint="default"/>
+        <w:sz w:val="20"/>
+      </w:rPr>
+    </w:lvl>
+    <w:lvl w:ilvl="4" w:tentative="1">
+      <w:start w:val="1"/>
+      <w:numFmt w:val="bullet"/>
+      <w:lvlText w:val=""/>
+      <w:lvlJc w:val="left"/>
+      <w:pPr>
+        <w:tabs>
+          <w:tab w:val="num" w:pos="3600"/>
+        </w:tabs>
+        <w:ind w:left="3600" w:hanging="360"/>
+      </w:pPr>
+      <w:rPr>
+        <w:rFonts w:ascii="Wingdings" w:hAnsi="Wingdings" w:hint="default"/>
+        <w:sz w:val="20"/>
+      </w:rPr>
+    </w:lvl>
+    <w:lvl w:ilvl="5" w:tentative="1">
+      <w:start w:val="1"/>
+      <w:numFmt w:val="bullet"/>
+      <w:lvlText w:val=""/>
+      <w:lvlJc w:val="left"/>
+      <w:pPr>
+        <w:tabs>
+          <w:tab w:val="num" w:pos="4320"/>
+        </w:tabs>
+        <w:ind w:left="4320" w:hanging="360"/>
+      </w:pPr>
+      <w:rPr>
+        <w:rFonts w:ascii="Wingdings" w:hAnsi="Wingdings" w:hint="default"/>
+        <w:sz w:val="20"/>
+      </w:rPr>
+    </w:lvl>
+    <w:lvl w:ilvl="6" w:tentative="1">
+      <w:start w:val="1"/>
+      <w:numFmt w:val="bullet"/>
+      <w:lvlText w:val=""/>
+      <w:lvlJc w:val="left"/>
+      <w:pPr>
+        <w:tabs>
+          <w:tab w:val="num" w:pos="5040"/>
+        </w:tabs>
+        <w:ind w:left="5040" w:hanging="360"/>
+      </w:pPr>
+      <w:rPr>
+        <w:rFonts w:ascii="Wingdings" w:hAnsi="Wingdings" w:hint="default"/>
+        <w:sz w:val="20"/>
+      </w:rPr>
+    </w:lvl>
+    <w:lvl w:ilvl="7" w:tentative="1">
+      <w:start w:val="1"/>
+      <w:numFmt w:val="bullet"/>
+      <w:lvlText w:val=""/>
+      <w:lvlJc w:val="left"/>
+      <w:pPr>
+        <w:tabs>
+          <w:tab w:val="num" w:pos="5760"/>
+        </w:tabs>
+        <w:ind w:left="5760" w:hanging="360"/>
+      </w:pPr>
+      <w:rPr>
+        <w:rFonts w:ascii="Wingdings" w:hAnsi="Wingdings" w:hint="default"/>
+        <w:sz w:val="20"/>
+      </w:rPr>
+    </w:lvl>
+    <w:lvl w:ilvl="8" w:tentative="1">
+      <w:start w:val="1"/>
+      <w:numFmt w:val="bullet"/>
+      <w:lvlText w:val=""/>
+      <w:lvlJc w:val="left"/>
+      <w:pPr>
+        <w:tabs>
+          <w:tab w:val="num" w:pos="6480"/>
+        </w:tabs>
+        <w:ind w:left="6480" w:hanging="360"/>
+      </w:pPr>
+      <w:rPr>
+        <w:rFonts w:ascii="Wingdings" w:hAnsi="Wingdings" w:hint="default"/>
+        <w:sz w:val="20"/>
+      </w:rPr>
+    </w:lvl>
+  </w:abstractNum>
+  <w:abstractNum w:abstractNumId="7" w15:restartNumberingAfterBreak="0">
+    <w:nsid w:val="53344B6F"/>
+    <w:multiLevelType w:val="multilevel"/>
+    <w:tmpl w:val="2C8A04A8"/>
     <w:lvl w:ilvl="0">
       <w:start w:val="1"/>
       <w:numFmt w:val="bullet"/>
@@ -1827,13 +2949,22 @@
     <w:abstractNumId w:val="0"/>
   </w:num>
   <w:num w:numId="3" w16cid:durableId="115173927">
-    <w:abstractNumId w:val="4"/>
+    <w:abstractNumId w:val="6"/>
   </w:num>
   <w:num w:numId="4" w16cid:durableId="2089299399">
-    <w:abstractNumId w:val="3"/>
+    <w:abstractNumId w:val="4"/>
   </w:num>
   <w:num w:numId="5" w16cid:durableId="1938559832">
     <w:abstractNumId w:val="1"/>
+  </w:num>
+  <w:num w:numId="6" w16cid:durableId="1070344596">
+    <w:abstractNumId w:val="5"/>
+  </w:num>
+  <w:num w:numId="7" w16cid:durableId="1994798136">
+    <w:abstractNumId w:val="7"/>
+  </w:num>
+  <w:num w:numId="8" w16cid:durableId="2139646545">
+    <w:abstractNumId w:val="3"/>
   </w:num>
 </w:numbering>
 </file>

</xml_diff>

<commit_message>
Bugfix: Reorder dashboard page router and restore missing brand diagnostics data maps
</commit_message>
<xml_diff>
--- a/ITC PROJECT LOGIC.docx
+++ b/ITC PROJECT LOGIC.docx
@@ -1042,37 +1042,19 @@
         <w:rPr>
           <w:b/>
           <w:bCs/>
-          <w:sz w:val="24"/>
-          <w:szCs w:val="24"/>
-        </w:rPr>
-      </w:pPr>
-      <w:r>
-        <w:rPr>
-          <w:b/>
-          <w:bCs/>
-          <w:sz w:val="24"/>
-          <w:szCs w:val="24"/>
+          <w:sz w:val="32"/>
+          <w:szCs w:val="32"/>
+        </w:rPr>
+      </w:pPr>
+      <w:r>
+        <w:rPr>
+          <w:b/>
+          <w:bCs/>
+          <w:sz w:val="32"/>
+          <w:szCs w:val="32"/>
         </w:rPr>
         <w:lastRenderedPageBreak/>
-        <w:t xml:space="preserve">Project </w:t>
-      </w:r>
-      <w:r>
-        <w:rPr>
-          <w:b/>
-          <w:bCs/>
-          <w:sz w:val="24"/>
-          <w:szCs w:val="24"/>
-        </w:rPr>
-        <w:t>Plan</w:t>
-      </w:r>
-      <w:r>
-        <w:rPr>
-          <w:b/>
-          <w:bCs/>
-          <w:sz w:val="24"/>
-          <w:szCs w:val="24"/>
-        </w:rPr>
-        <w:t>: Transitioning to an API-Driven Architecture</w:t>
+        <w:t>Project Plan: Transitioning to an API-Driven Architecture</w:t>
       </w:r>
     </w:p>
     <w:p>
@@ -1557,7 +1539,7 @@
           <w:sz w:val="24"/>
           <w:szCs w:val="24"/>
         </w:rPr>
-        <w:t>3. Implementation Roadmap (Our TO-DO List)</w:t>
+        <w:t>3. Implementation Roadmap (TO-DO List)</w:t>
       </w:r>
     </w:p>
     <w:p>
@@ -1591,6 +1573,7 @@
           <w:sz w:val="24"/>
           <w:szCs w:val="24"/>
         </w:rPr>
+        <w:lastRenderedPageBreak/>
         <w:t>Task A: Build the Web API (Backend Extension)</w:t>
       </w:r>
     </w:p>
@@ -1612,7 +1595,6 @@
           <w:sz w:val="24"/>
           <w:szCs w:val="24"/>
         </w:rPr>
-        <w:lastRenderedPageBreak/>
         <w:t>Plan:</w:t>
       </w:r>
       <w:r>
@@ -1633,22 +1615,6 @@
         <w:t>FastAPI</w:t>
       </w:r>
       <w:proofErr w:type="spellEnd"/>
-      <w:r>
-        <w:rPr>
-          <w:sz w:val="24"/>
-          <w:szCs w:val="24"/>
-        </w:rPr>
-        <w:t xml:space="preserve"> or </w:t>
-      </w:r>
-      <w:r>
-        <w:rPr>
-          <w:b/>
-          <w:bCs/>
-          <w:sz w:val="24"/>
-          <w:szCs w:val="24"/>
-        </w:rPr>
-        <w:t>Flask</w:t>
-      </w:r>
       <w:r>
         <w:rPr>
           <w:sz w:val="24"/>
@@ -1776,6 +1742,1294 @@
         <w:t xml:space="preserve"> An operator can type in a test order (for example: 5 units of Fiama Gel Bar) and click submit. This submission will hit our new API, add the row to our MySQL database, and instantly update our analytics charts.</w:t>
       </w:r>
     </w:p>
+    <w:p/>
+    <w:p/>
+    <w:p/>
+    <w:p/>
+    <w:p/>
+    <w:p/>
+    <w:p/>
+    <w:p/>
+    <w:p/>
+    <w:p/>
+    <w:p/>
+    <w:p/>
+    <w:p/>
+    <w:p/>
+    <w:p/>
+    <w:p/>
+    <w:p/>
+    <w:p/>
+    <w:p/>
+    <w:p/>
+    <w:p>
+      <w:pPr>
+        <w:jc w:val="center"/>
+        <w:rPr>
+          <w:rFonts w:ascii="Times New Roman" w:hAnsi="Times New Roman" w:cs="Times New Roman"/>
+          <w:b/>
+          <w:bCs/>
+          <w:sz w:val="32"/>
+          <w:szCs w:val="32"/>
+        </w:rPr>
+      </w:pPr>
+      <w:r>
+        <w:rPr>
+          <w:rFonts w:ascii="Times New Roman" w:hAnsi="Times New Roman" w:cs="Times New Roman"/>
+          <w:b/>
+          <w:bCs/>
+          <w:sz w:val="32"/>
+          <w:szCs w:val="32"/>
+        </w:rPr>
+        <w:lastRenderedPageBreak/>
+        <w:t>THREE LAYER ARCHITECTURE</w:t>
+      </w:r>
+    </w:p>
+    <w:p>
+      <w:pPr>
+        <w:pBdr>
+          <w:top w:val="single" w:sz="4" w:space="1" w:color="auto"/>
+          <w:left w:val="single" w:sz="4" w:space="4" w:color="auto"/>
+          <w:bottom w:val="single" w:sz="4" w:space="1" w:color="auto"/>
+          <w:right w:val="single" w:sz="4" w:space="4" w:color="auto"/>
+        </w:pBdr>
+      </w:pPr>
+      <w:r>
+        <w:t>Layer 1: Frontend User Portal  (web_server.py)</w:t>
+      </w:r>
+    </w:p>
+    <w:p>
+      <w:pPr>
+        <w:pBdr>
+          <w:top w:val="single" w:sz="4" w:space="1" w:color="auto"/>
+          <w:left w:val="single" w:sz="4" w:space="4" w:color="auto"/>
+          <w:bottom w:val="single" w:sz="4" w:space="1" w:color="auto"/>
+          <w:right w:val="single" w:sz="4" w:space="4" w:color="auto"/>
+        </w:pBdr>
+      </w:pPr>
+      <w:r>
+        <w:t xml:space="preserve">               │</w:t>
+      </w:r>
+    </w:p>
+    <w:p>
+      <w:pPr>
+        <w:pBdr>
+          <w:top w:val="single" w:sz="4" w:space="1" w:color="auto"/>
+          <w:left w:val="single" w:sz="4" w:space="4" w:color="auto"/>
+          <w:bottom w:val="single" w:sz="4" w:space="1" w:color="auto"/>
+          <w:right w:val="single" w:sz="4" w:space="4" w:color="auto"/>
+        </w:pBdr>
+      </w:pPr>
+      <w:r>
+        <w:t xml:space="preserve">          (HTTP JSON)</w:t>
+      </w:r>
+    </w:p>
+    <w:p>
+      <w:pPr>
+        <w:pBdr>
+          <w:top w:val="single" w:sz="4" w:space="1" w:color="auto"/>
+          <w:left w:val="single" w:sz="4" w:space="4" w:color="auto"/>
+          <w:bottom w:val="single" w:sz="4" w:space="1" w:color="auto"/>
+          <w:right w:val="single" w:sz="4" w:space="4" w:color="auto"/>
+        </w:pBdr>
+      </w:pPr>
+      <w:r>
+        <w:t xml:space="preserve">               </w:t>
+      </w:r>
+      <w:r>
+        <w:rPr>
+          <w:rFonts w:ascii="Arial" w:hAnsi="Arial" w:cs="Arial"/>
+        </w:rPr>
+        <w:t>▼</w:t>
+      </w:r>
+    </w:p>
+    <w:p>
+      <w:pPr>
+        <w:pBdr>
+          <w:top w:val="single" w:sz="4" w:space="1" w:color="auto"/>
+          <w:left w:val="single" w:sz="4" w:space="4" w:color="auto"/>
+          <w:bottom w:val="single" w:sz="4" w:space="1" w:color="auto"/>
+          <w:right w:val="single" w:sz="4" w:space="4" w:color="auto"/>
+        </w:pBdr>
+      </w:pPr>
+      <w:r>
+        <w:t>Layer 2: Middleware API Gateway (api_server.py)</w:t>
+      </w:r>
+    </w:p>
+    <w:p>
+      <w:pPr>
+        <w:pBdr>
+          <w:top w:val="single" w:sz="4" w:space="1" w:color="auto"/>
+          <w:left w:val="single" w:sz="4" w:space="4" w:color="auto"/>
+          <w:bottom w:val="single" w:sz="4" w:space="1" w:color="auto"/>
+          <w:right w:val="single" w:sz="4" w:space="4" w:color="auto"/>
+        </w:pBdr>
+      </w:pPr>
+      <w:r>
+        <w:t xml:space="preserve">               │</w:t>
+      </w:r>
+    </w:p>
+    <w:p>
+      <w:pPr>
+        <w:pBdr>
+          <w:top w:val="single" w:sz="4" w:space="1" w:color="auto"/>
+          <w:left w:val="single" w:sz="4" w:space="4" w:color="auto"/>
+          <w:bottom w:val="single" w:sz="4" w:space="1" w:color="auto"/>
+          <w:right w:val="single" w:sz="4" w:space="4" w:color="auto"/>
+        </w:pBdr>
+      </w:pPr>
+      <w:r>
+        <w:t xml:space="preserve">       (</w:t>
+      </w:r>
+      <w:proofErr w:type="spellStart"/>
+      <w:r>
+        <w:t>SQLAlchemy</w:t>
+      </w:r>
+      <w:proofErr w:type="spellEnd"/>
+      <w:r>
+        <w:t xml:space="preserve"> </w:t>
+      </w:r>
+      <w:r>
+        <w:t>)</w:t>
+      </w:r>
+    </w:p>
+    <w:p>
+      <w:pPr>
+        <w:pBdr>
+          <w:top w:val="single" w:sz="4" w:space="1" w:color="auto"/>
+          <w:left w:val="single" w:sz="4" w:space="4" w:color="auto"/>
+          <w:bottom w:val="single" w:sz="4" w:space="1" w:color="auto"/>
+          <w:right w:val="single" w:sz="4" w:space="4" w:color="auto"/>
+        </w:pBdr>
+      </w:pPr>
+      <w:r>
+        <w:t xml:space="preserve">               </w:t>
+      </w:r>
+      <w:r>
+        <w:rPr>
+          <w:rFonts w:ascii="Arial" w:hAnsi="Arial" w:cs="Arial"/>
+        </w:rPr>
+        <w:t>▼</w:t>
+      </w:r>
+    </w:p>
+    <w:p>
+      <w:pPr>
+        <w:pBdr>
+          <w:top w:val="single" w:sz="4" w:space="1" w:color="auto"/>
+          <w:left w:val="single" w:sz="4" w:space="4" w:color="auto"/>
+          <w:bottom w:val="single" w:sz="4" w:space="1" w:color="auto"/>
+          <w:right w:val="single" w:sz="4" w:space="4" w:color="auto"/>
+        </w:pBdr>
+      </w:pPr>
+      <w:r>
+        <w:t xml:space="preserve">Layer 3: </w:t>
+      </w:r>
+      <w:proofErr w:type="spellStart"/>
+      <w:r>
+        <w:t>InsightPulse</w:t>
+      </w:r>
+      <w:proofErr w:type="spellEnd"/>
+      <w:r>
+        <w:t xml:space="preserve"> Dashboard and Database Storage (app.py)</w:t>
+      </w:r>
+    </w:p>
+    <w:p/>
+    <w:p/>
+    <w:p>
+      <w:pPr>
+        <w:rPr>
+          <w:rFonts w:ascii="Times New Roman" w:hAnsi="Times New Roman" w:cs="Times New Roman"/>
+          <w:b/>
+          <w:bCs/>
+          <w:sz w:val="28"/>
+          <w:szCs w:val="28"/>
+          <w:u w:val="single"/>
+        </w:rPr>
+      </w:pPr>
+      <w:r>
+        <w:rPr>
+          <w:rFonts w:ascii="Times New Roman" w:hAnsi="Times New Roman" w:cs="Times New Roman"/>
+          <w:b/>
+          <w:bCs/>
+          <w:sz w:val="28"/>
+          <w:szCs w:val="28"/>
+          <w:u w:val="single"/>
+        </w:rPr>
+        <w:t>Layer 1: The E-Commerce Web Server (web_server.py)</w:t>
+      </w:r>
+    </w:p>
+    <w:p>
+      <w:pPr>
+        <w:rPr>
+          <w:b/>
+          <w:bCs/>
+        </w:rPr>
+      </w:pPr>
+      <w:r>
+        <w:rPr>
+          <w:b/>
+          <w:bCs/>
+        </w:rPr>
+        <w:t>What it is:</w:t>
+      </w:r>
+    </w:p>
+    <w:p>
+      <w:r>
+        <w:t xml:space="preserve">This is the </w:t>
+      </w:r>
+      <w:r>
+        <w:rPr>
+          <w:b/>
+          <w:bCs/>
+        </w:rPr>
+        <w:t>customer-facing storefront interface</w:t>
+      </w:r>
+      <w:r>
+        <w:t>. It handles the user experience (UX) and data collection.</w:t>
+      </w:r>
+    </w:p>
+    <w:p>
+      <w:pPr>
+        <w:rPr>
+          <w:b/>
+          <w:bCs/>
+        </w:rPr>
+      </w:pPr>
+      <w:r>
+        <w:rPr>
+          <w:b/>
+          <w:bCs/>
+        </w:rPr>
+        <w:t>How it works:</w:t>
+      </w:r>
+    </w:p>
+    <w:p>
+      <w:pPr>
+        <w:numPr>
+          <w:ilvl w:val="0"/>
+          <w:numId w:val="9"/>
+        </w:numPr>
+      </w:pPr>
+      <w:r>
+        <w:rPr>
+          <w:b/>
+          <w:bCs/>
+        </w:rPr>
+        <w:t>Dynamic Form Binding:</w:t>
+      </w:r>
+      <w:r>
+        <w:t xml:space="preserve"> The portal loads an interactive </w:t>
+      </w:r>
+      <w:proofErr w:type="spellStart"/>
+      <w:r>
+        <w:t>catalog</w:t>
+      </w:r>
+      <w:proofErr w:type="spellEnd"/>
+      <w:r>
+        <w:t xml:space="preserve"> showing ITC groups like </w:t>
+      </w:r>
+      <w:r>
+        <w:rPr>
+          <w:i/>
+          <w:iCs/>
+        </w:rPr>
+        <w:t>Fiama, Vivel, and Engage</w:t>
+      </w:r>
+      <w:r>
+        <w:t>. Because it executes dynamically outside of rigid form cages, selecting a brand instantly updates the product variation array right in front of the user.</w:t>
+      </w:r>
+    </w:p>
+    <w:p>
+      <w:pPr>
+        <w:numPr>
+          <w:ilvl w:val="0"/>
+          <w:numId w:val="9"/>
+        </w:numPr>
+      </w:pPr>
+      <w:r>
+        <w:rPr>
+          <w:b/>
+          <w:bCs/>
+        </w:rPr>
+        <w:t>Data Packaging:</w:t>
+      </w:r>
+      <w:r>
+        <w:t xml:space="preserve"> When an operator places an order, the frontend instantly rounds off the totals and wraps the choices into a standard web data package called a </w:t>
+      </w:r>
+      <w:r>
+        <w:rPr>
+          <w:b/>
+          <w:bCs/>
+        </w:rPr>
+        <w:t>JSON Payload</w:t>
+      </w:r>
+      <w:r>
+        <w:t>.</w:t>
+      </w:r>
+    </w:p>
+    <w:p>
+      <w:pPr>
+        <w:numPr>
+          <w:ilvl w:val="0"/>
+          <w:numId w:val="9"/>
+        </w:numPr>
+      </w:pPr>
+      <w:r>
+        <w:rPr>
+          <w:b/>
+          <w:bCs/>
+        </w:rPr>
+        <w:t>The Web Hook:</w:t>
+      </w:r>
+      <w:r>
+        <w:t xml:space="preserve"> It uses a network messenger called requests to fire that JSON package across your local network to port 8000, which is where your backend is listening.</w:t>
+      </w:r>
+    </w:p>
+    <w:p>
+      <w:pPr>
+        <w:numPr>
+          <w:ilvl w:val="0"/>
+          <w:numId w:val="9"/>
+        </w:numPr>
+      </w:pPr>
+      <w:r>
+        <w:rPr>
+          <w:b/>
+          <w:bCs/>
+        </w:rPr>
+        <w:t>Cache Invalidation:</w:t>
+      </w:r>
+      <w:r>
+        <w:t xml:space="preserve"> The moment the web server receives a success confirmation from the network, it runs </w:t>
+      </w:r>
+      <w:proofErr w:type="spellStart"/>
+      <w:r>
+        <w:t>st.cache_data.clear</w:t>
+      </w:r>
+      <w:proofErr w:type="spellEnd"/>
+      <w:r>
+        <w:t>(). This is a crucial data engineering detail: it tells the system to drop old memory snapshots so your analytics panels show the new data instantly without manual app restarts.</w:t>
+      </w:r>
+    </w:p>
+    <w:p>
+      <w:pPr>
+        <w:ind w:left="720"/>
+      </w:pPr>
+    </w:p>
+    <w:p>
+      <w:pPr>
+        <w:rPr>
+          <w:rFonts w:ascii="Times New Roman" w:hAnsi="Times New Roman" w:cs="Times New Roman"/>
+          <w:b/>
+          <w:bCs/>
+          <w:sz w:val="28"/>
+          <w:szCs w:val="28"/>
+          <w:u w:val="single"/>
+        </w:rPr>
+      </w:pPr>
+      <w:r>
+        <w:rPr>
+          <w:rFonts w:ascii="Times New Roman" w:hAnsi="Times New Roman" w:cs="Times New Roman"/>
+          <w:b/>
+          <w:bCs/>
+          <w:sz w:val="28"/>
+          <w:szCs w:val="28"/>
+          <w:u w:val="single"/>
+        </w:rPr>
+        <w:t>Layer 2: The Middleware API Gateway (api_server.py)</w:t>
+      </w:r>
+    </w:p>
+    <w:p>
+      <w:pPr>
+        <w:rPr>
+          <w:b/>
+          <w:bCs/>
+        </w:rPr>
+      </w:pPr>
+      <w:r>
+        <w:rPr>
+          <w:b/>
+          <w:bCs/>
+        </w:rPr>
+        <w:t>What it is:</w:t>
+      </w:r>
+    </w:p>
+    <w:p>
+      <w:r>
+        <w:t xml:space="preserve">This is the </w:t>
+      </w:r>
+      <w:r>
+        <w:rPr>
+          <w:b/>
+          <w:bCs/>
+        </w:rPr>
+        <w:t>brain and the firewall of the backend</w:t>
+      </w:r>
+      <w:r>
+        <w:t>. It acts as a security checkpoint between the messy public internet and your private database.</w:t>
+      </w:r>
+    </w:p>
+    <w:p>
+      <w:pPr>
+        <w:rPr>
+          <w:b/>
+          <w:bCs/>
+        </w:rPr>
+      </w:pPr>
+      <w:r>
+        <w:rPr>
+          <w:b/>
+          <w:bCs/>
+        </w:rPr>
+        <w:lastRenderedPageBreak/>
+        <w:t>How it works:</w:t>
+      </w:r>
+    </w:p>
+    <w:p>
+      <w:pPr>
+        <w:numPr>
+          <w:ilvl w:val="0"/>
+          <w:numId w:val="10"/>
+        </w:numPr>
+      </w:pPr>
+      <w:r>
+        <w:rPr>
+          <w:b/>
+          <w:bCs/>
+        </w:rPr>
+        <w:t xml:space="preserve">The </w:t>
+      </w:r>
+      <w:proofErr w:type="spellStart"/>
+      <w:r>
+        <w:rPr>
+          <w:b/>
+          <w:bCs/>
+        </w:rPr>
+        <w:t>Uvicorn</w:t>
+      </w:r>
+      <w:proofErr w:type="spellEnd"/>
+      <w:r>
+        <w:rPr>
+          <w:b/>
+          <w:bCs/>
+        </w:rPr>
+        <w:t xml:space="preserve"> Listener:</w:t>
+      </w:r>
+      <w:r>
+        <w:t xml:space="preserve"> This script runs an independent, high-performance lightning web server framework called </w:t>
+      </w:r>
+      <w:proofErr w:type="spellStart"/>
+      <w:r>
+        <w:rPr>
+          <w:b/>
+          <w:bCs/>
+        </w:rPr>
+        <w:t>FastAPI</w:t>
+      </w:r>
+      <w:proofErr w:type="spellEnd"/>
+      <w:r>
+        <w:t xml:space="preserve"> on local port 8000. It sits there constantly waiting to process incoming traffic.</w:t>
+      </w:r>
+    </w:p>
+    <w:p>
+      <w:pPr>
+        <w:numPr>
+          <w:ilvl w:val="0"/>
+          <w:numId w:val="10"/>
+        </w:numPr>
+      </w:pPr>
+      <w:r>
+        <w:rPr>
+          <w:b/>
+          <w:bCs/>
+        </w:rPr>
+        <w:t>Strict Schema Validation (</w:t>
+      </w:r>
+      <w:proofErr w:type="spellStart"/>
+      <w:r>
+        <w:rPr>
+          <w:b/>
+          <w:bCs/>
+        </w:rPr>
+        <w:t>Pydantic</w:t>
+      </w:r>
+      <w:proofErr w:type="spellEnd"/>
+      <w:r>
+        <w:rPr>
+          <w:b/>
+          <w:bCs/>
+        </w:rPr>
+        <w:t>):</w:t>
+      </w:r>
+      <w:r>
+        <w:t xml:space="preserve"> The API doesn't just blindly accept data. It uses a validation engine called </w:t>
+      </w:r>
+      <w:proofErr w:type="spellStart"/>
+      <w:r>
+        <w:t>TransactionSchema</w:t>
+      </w:r>
+      <w:proofErr w:type="spellEnd"/>
+      <w:r>
+        <w:t>. If a hacker tries to inject broken text, bad script tags, or an invalid entry format, the API blocks the request instantly at the perimeter before it can reach your database.</w:t>
+      </w:r>
+    </w:p>
+    <w:p>
+      <w:pPr>
+        <w:numPr>
+          <w:ilvl w:val="0"/>
+          <w:numId w:val="10"/>
+        </w:numPr>
+      </w:pPr>
+      <w:r>
+        <w:rPr>
+          <w:b/>
+          <w:bCs/>
+        </w:rPr>
+        <w:t>SQL Injection Protection:</w:t>
+      </w:r>
+      <w:r>
+        <w:t xml:space="preserve"> Once the payload passes security verification, the API communicates with your database using an enterprise tool called </w:t>
+      </w:r>
+      <w:proofErr w:type="spellStart"/>
+      <w:r>
+        <w:rPr>
+          <w:b/>
+          <w:bCs/>
+        </w:rPr>
+        <w:t>SQLAlchemy</w:t>
+      </w:r>
+      <w:proofErr w:type="spellEnd"/>
+      <w:r>
+        <w:t xml:space="preserve">. Instead of sticking variables directly into string chains, it writes the row using </w:t>
+      </w:r>
+      <w:r>
+        <w:rPr>
+          <w:i/>
+          <w:iCs/>
+        </w:rPr>
+        <w:t>parameterized queries</w:t>
+      </w:r>
+      <w:r>
+        <w:t xml:space="preserve"> (:</w:t>
+      </w:r>
+      <w:proofErr w:type="spellStart"/>
+      <w:r>
+        <w:t>tid</w:t>
+      </w:r>
+      <w:proofErr w:type="spellEnd"/>
+      <w:r>
+        <w:t>, :brand, :qty). This makes it impossible for bad data inputs to break or corrupt your tables.</w:t>
+      </w:r>
+    </w:p>
+    <w:p/>
+    <w:p>
+      <w:pPr>
+        <w:rPr>
+          <w:rFonts w:ascii="Times New Roman" w:hAnsi="Times New Roman" w:cs="Times New Roman"/>
+          <w:b/>
+          <w:bCs/>
+          <w:sz w:val="28"/>
+          <w:szCs w:val="28"/>
+          <w:u w:val="single"/>
+        </w:rPr>
+      </w:pPr>
+      <w:r>
+        <w:rPr>
+          <w:rFonts w:ascii="Times New Roman" w:hAnsi="Times New Roman" w:cs="Times New Roman"/>
+          <w:b/>
+          <w:bCs/>
+          <w:sz w:val="28"/>
+          <w:szCs w:val="28"/>
+          <w:u w:val="single"/>
+        </w:rPr>
+        <w:t>Layer 3: Relational Storage &amp; Core Analytics (app.py)</w:t>
+      </w:r>
+    </w:p>
+    <w:p>
+      <w:pPr>
+        <w:rPr>
+          <w:b/>
+          <w:bCs/>
+        </w:rPr>
+      </w:pPr>
+      <w:r>
+        <w:rPr>
+          <w:b/>
+          <w:bCs/>
+        </w:rPr>
+        <w:t>What it is:</w:t>
+      </w:r>
+    </w:p>
+    <w:p>
+      <w:r>
+        <w:t xml:space="preserve">This is the </w:t>
+      </w:r>
+      <w:proofErr w:type="spellStart"/>
+      <w:r>
+        <w:rPr>
+          <w:b/>
+          <w:bCs/>
+        </w:rPr>
+        <w:t>InsightPulse</w:t>
+      </w:r>
+      <w:proofErr w:type="spellEnd"/>
+      <w:r>
+        <w:rPr>
+          <w:b/>
+          <w:bCs/>
+        </w:rPr>
+        <w:t xml:space="preserve"> (Dashboard</w:t>
+      </w:r>
+      <w:r>
+        <w:rPr>
+          <w:b/>
+          <w:bCs/>
+        </w:rPr>
+        <w:t>) Control Room</w:t>
+      </w:r>
+      <w:r>
+        <w:t xml:space="preserve"> powered by an underlying relational engine (</w:t>
+      </w:r>
+      <w:r>
+        <w:rPr>
+          <w:b/>
+          <w:bCs/>
+        </w:rPr>
+        <w:t>XAMPP MySQL</w:t>
+      </w:r>
+      <w:r>
+        <w:t>).</w:t>
+      </w:r>
+    </w:p>
+    <w:p>
+      <w:pPr>
+        <w:rPr>
+          <w:b/>
+          <w:bCs/>
+        </w:rPr>
+      </w:pPr>
+      <w:r>
+        <w:rPr>
+          <w:b/>
+          <w:bCs/>
+        </w:rPr>
+        <w:t>How it work</w:t>
+      </w:r>
+      <w:r>
+        <w:rPr>
+          <w:b/>
+          <w:bCs/>
+        </w:rPr>
+        <w:t>s</w:t>
+      </w:r>
+      <w:r>
+        <w:rPr>
+          <w:b/>
+          <w:bCs/>
+        </w:rPr>
+        <w:t>:</w:t>
+      </w:r>
+    </w:p>
+    <w:p>
+      <w:pPr>
+        <w:numPr>
+          <w:ilvl w:val="0"/>
+          <w:numId w:val="11"/>
+        </w:numPr>
+      </w:pPr>
+      <w:r>
+        <w:rPr>
+          <w:b/>
+          <w:bCs/>
+        </w:rPr>
+        <w:t>Natively Automated Database Engine:</w:t>
+      </w:r>
+      <w:r>
+        <w:t xml:space="preserve"> Your MySQL storage server runs silently as an integrated Windows service engine on port 3306. It accepts the incoming writes from the API server and appends them securely onto the persistent storage rows.</w:t>
+      </w:r>
+    </w:p>
+    <w:p>
+      <w:pPr>
+        <w:numPr>
+          <w:ilvl w:val="0"/>
+          <w:numId w:val="11"/>
+        </w:numPr>
+      </w:pPr>
+      <w:r>
+        <w:rPr>
+          <w:b/>
+          <w:bCs/>
+        </w:rPr>
+        <w:t>Real-time Analytical Pipelines:</w:t>
+      </w:r>
+      <w:r>
+        <w:t xml:space="preserve"> The main dashboard (app.py) loads data directly from those relational records. Because the frontend cleared the global cache arrays during checkout, clicking over to the analytics console triggers a fresh read.</w:t>
+      </w:r>
+    </w:p>
+    <w:p>
+      <w:pPr>
+        <w:numPr>
+          <w:ilvl w:val="0"/>
+          <w:numId w:val="11"/>
+        </w:numPr>
+      </w:pPr>
+      <w:r>
+        <w:rPr>
+          <w:b/>
+          <w:bCs/>
+        </w:rPr>
+        <w:t>Dynamic Recalculations:</w:t>
+      </w:r>
+      <w:r>
+        <w:t xml:space="preserve"> Your chart engines (</w:t>
+      </w:r>
+      <w:r>
+        <w:rPr>
+          <w:b/>
+          <w:bCs/>
+        </w:rPr>
+        <w:t>Plotly Express &amp; Graph Objects</w:t>
+      </w:r>
+      <w:r>
+        <w:t xml:space="preserve">) immediately re-evaluate your metrics, reflecting the newly made transaction in your </w:t>
+      </w:r>
+      <w:r>
+        <w:rPr>
+          <w:i/>
+          <w:iCs/>
+        </w:rPr>
+        <w:t>Daily Trends, Regional Revenue distributions, and Total Units sold</w:t>
+      </w:r>
+      <w:r>
+        <w:t xml:space="preserve"> counters right away!</w:t>
+      </w:r>
+    </w:p>
+    <w:p/>
+    <w:p/>
+    <w:p/>
+    <w:p/>
+    <w:p/>
+    <w:p/>
+    <w:p/>
+    <w:p/>
+    <w:p>
+      <w:pPr>
+        <w:rPr>
+          <w:b/>
+          <w:bCs/>
+        </w:rPr>
+      </w:pPr>
+      <w:r>
+        <w:rPr>
+          <w:b/>
+          <w:bCs/>
+        </w:rPr>
+        <w:lastRenderedPageBreak/>
+        <w:t>1. Fixing the "Channel Selection" Error</w:t>
+      </w:r>
+    </w:p>
+    <w:p>
+      <w:r>
+        <w:rPr>
+          <w:b/>
+          <w:bCs/>
+        </w:rPr>
+        <w:t>What it means:</w:t>
+      </w:r>
+      <w:r>
+        <w:t xml:space="preserve"> When you shop on Amazon, there is no dropdown box asking you, </w:t>
+      </w:r>
+      <w:r>
+        <w:rPr>
+          <w:i/>
+          <w:iCs/>
+        </w:rPr>
+        <w:t>"Are you buying this on Amazon or at a local store?"</w:t>
+      </w:r>
+      <w:r>
+        <w:t xml:space="preserve"> The fact that you are visiting the Amazon website means the channel is already E-Commerce.</w:t>
+      </w:r>
+    </w:p>
+    <w:p>
+      <w:r>
+        <w:rPr>
+          <w:b/>
+          <w:bCs/>
+        </w:rPr>
+        <w:t>The Fix:</w:t>
+      </w:r>
+      <w:r>
+        <w:t xml:space="preserve"> In your storefront code (web_server.py), we will </w:t>
+      </w:r>
+      <w:r>
+        <w:rPr>
+          <w:b/>
+          <w:bCs/>
+        </w:rPr>
+        <w:t>delete the Channel dropdown box completely</w:t>
+      </w:r>
+      <w:r>
+        <w:t xml:space="preserve">. Instead, when a user clicks "Submit," the code will automatically attach "Channel": "E-Commerce" to the data background package (JSON) without showing it to the customer. </w:t>
+      </w:r>
+    </w:p>
+    <w:p>
+      <w:pPr>
+        <w:rPr>
+          <w:b/>
+          <w:bCs/>
+        </w:rPr>
+      </w:pPr>
+      <w:r>
+        <w:rPr>
+          <w:b/>
+          <w:bCs/>
+        </w:rPr>
+        <w:t>2. The Multi-Portal Ecosystem (The Three Portals)</w:t>
+      </w:r>
+    </w:p>
+    <w:p>
+      <w:r>
+        <w:t xml:space="preserve">ITC does not just sell items on a website. They sell in three different ways, and your manager wants a separate </w:t>
+      </w:r>
+      <w:r>
+        <w:rPr>
+          <w:b/>
+          <w:bCs/>
+        </w:rPr>
+        <w:t>order screen (portal)</w:t>
+      </w:r>
+      <w:r>
+        <w:t xml:space="preserve"> for each one: </w:t>
+      </w:r>
+    </w:p>
+    <w:p>
+      <w:pPr>
+        <w:numPr>
+          <w:ilvl w:val="0"/>
+          <w:numId w:val="16"/>
+        </w:numPr>
+      </w:pPr>
+      <w:r>
+        <w:rPr>
+          <w:b/>
+          <w:bCs/>
+        </w:rPr>
+        <w:t>Portal 1: The E-Commerce Storefront (B2C)</w:t>
+      </w:r>
+    </w:p>
+    <w:p>
+      <w:pPr>
+        <w:numPr>
+          <w:ilvl w:val="1"/>
+          <w:numId w:val="16"/>
+        </w:numPr>
+      </w:pPr>
+      <w:r>
+        <w:rPr>
+          <w:b/>
+          <w:bCs/>
+        </w:rPr>
+        <w:t>Who uses it:</w:t>
+      </w:r>
+      <w:r>
+        <w:t xml:space="preserve"> Normal everyday customers. </w:t>
+      </w:r>
+    </w:p>
+    <w:p>
+      <w:pPr>
+        <w:numPr>
+          <w:ilvl w:val="1"/>
+          <w:numId w:val="16"/>
+        </w:numPr>
+      </w:pPr>
+      <w:r>
+        <w:rPr>
+          <w:b/>
+          <w:bCs/>
+        </w:rPr>
+        <w:t>How it works:</w:t>
+      </w:r>
+      <w:r>
+        <w:t xml:space="preserve"> People buy 1 or 2 items (like a single </w:t>
+      </w:r>
+      <w:r>
+        <w:rPr>
+          <w:i/>
+          <w:iCs/>
+        </w:rPr>
+        <w:t>Fiama Gel Bar</w:t>
+      </w:r>
+      <w:r>
+        <w:t xml:space="preserve"> or </w:t>
+      </w:r>
+      <w:r>
+        <w:rPr>
+          <w:i/>
+          <w:iCs/>
+        </w:rPr>
+        <w:t>Shower Gel</w:t>
+      </w:r>
+      <w:r>
+        <w:t xml:space="preserve">) at standard retail price. </w:t>
+      </w:r>
+    </w:p>
+    <w:p>
+      <w:pPr>
+        <w:numPr>
+          <w:ilvl w:val="0"/>
+          <w:numId w:val="16"/>
+        </w:numPr>
+      </w:pPr>
+      <w:r>
+        <w:rPr>
+          <w:b/>
+          <w:bCs/>
+        </w:rPr>
+        <w:t>Portal 2: The Merchandising Portal (B2B)</w:t>
+      </w:r>
+    </w:p>
+    <w:p>
+      <w:pPr>
+        <w:numPr>
+          <w:ilvl w:val="1"/>
+          <w:numId w:val="16"/>
+        </w:numPr>
+      </w:pPr>
+      <w:r>
+        <w:rPr>
+          <w:b/>
+          <w:bCs/>
+        </w:rPr>
+        <w:t>Who uses it:</w:t>
+      </w:r>
+      <w:r>
+        <w:t xml:space="preserve"> Big department stores or supermarket chains (like </w:t>
+      </w:r>
+      <w:r>
+        <w:rPr>
+          <w:i/>
+          <w:iCs/>
+        </w:rPr>
+        <w:t>D-Mart</w:t>
+      </w:r>
+      <w:r>
+        <w:t xml:space="preserve"> or </w:t>
+      </w:r>
+      <w:r>
+        <w:rPr>
+          <w:i/>
+          <w:iCs/>
+        </w:rPr>
+        <w:t>Shoppers Stop</w:t>
+      </w:r>
+      <w:r>
+        <w:t>).</w:t>
+      </w:r>
+    </w:p>
+    <w:p>
+      <w:pPr>
+        <w:numPr>
+          <w:ilvl w:val="1"/>
+          <w:numId w:val="16"/>
+        </w:numPr>
+      </w:pPr>
+      <w:r>
+        <w:rPr>
+          <w:b/>
+          <w:bCs/>
+        </w:rPr>
+        <w:t>How it works:</w:t>
+      </w:r>
+      <w:r>
+        <w:t xml:space="preserve"> They buy in massive bulk quantities (like 500 boxes of </w:t>
+      </w:r>
+      <w:r>
+        <w:rPr>
+          <w:i/>
+          <w:iCs/>
+        </w:rPr>
+        <w:t>Engage Perfume</w:t>
+      </w:r>
+      <w:r>
+        <w:t>) and get wholesale discounts.</w:t>
+      </w:r>
+    </w:p>
+    <w:p>
+      <w:pPr>
+        <w:numPr>
+          <w:ilvl w:val="0"/>
+          <w:numId w:val="16"/>
+        </w:numPr>
+      </w:pPr>
+      <w:r>
+        <w:rPr>
+          <w:b/>
+          <w:bCs/>
+        </w:rPr>
+        <w:t>Portal 3: The Traditional Retailer / Dealer Portal (B2B Supply)</w:t>
+      </w:r>
+    </w:p>
+    <w:p>
+      <w:pPr>
+        <w:numPr>
+          <w:ilvl w:val="1"/>
+          <w:numId w:val="16"/>
+        </w:numPr>
+      </w:pPr>
+      <w:r>
+        <w:rPr>
+          <w:b/>
+          <w:bCs/>
+        </w:rPr>
+        <w:t>Who uses it:</w:t>
+      </w:r>
+      <w:r>
+        <w:t xml:space="preserve"> Local neighbo</w:t>
+      </w:r>
+      <w:r>
+        <w:t>u</w:t>
+      </w:r>
+      <w:r>
+        <w:t>rhood distributors and stockists.</w:t>
+      </w:r>
+    </w:p>
+    <w:p>
+      <w:pPr>
+        <w:numPr>
+          <w:ilvl w:val="1"/>
+          <w:numId w:val="16"/>
+        </w:numPr>
+      </w:pPr>
+      <w:r>
+        <w:rPr>
+          <w:b/>
+          <w:bCs/>
+        </w:rPr>
+        <w:t>How it works:</w:t>
+      </w:r>
+      <w:r>
+        <w:t xml:space="preserve"> They order crates of inventory directly from ITC warehouses to restock physical shops.</w:t>
+      </w:r>
+    </w:p>
+    <w:p>
+      <w:pPr>
+        <w:rPr>
+          <w:b/>
+          <w:bCs/>
+        </w:rPr>
+      </w:pPr>
+      <w:r>
+        <w:rPr>
+          <w:b/>
+          <w:bCs/>
+        </w:rPr>
+        <w:t>3. Local Dashboards vs. The Master Admin Dashboard</w:t>
+      </w:r>
+    </w:p>
+    <w:p>
+      <w:r>
+        <w:t xml:space="preserve">This is the part about the different dashboards. It is all about </w:t>
+      </w:r>
+      <w:r>
+        <w:rPr>
+          <w:b/>
+          <w:bCs/>
+        </w:rPr>
+        <w:t>who is looking at the screen</w:t>
+      </w:r>
+      <w:r>
+        <w:t>:</w:t>
+      </w:r>
+    </w:p>
+    <w:p>
+      <w:pPr>
+        <w:rPr>
+          <w:b/>
+          <w:bCs/>
+        </w:rPr>
+      </w:pPr>
+      <w:r>
+        <w:rPr>
+          <w:b/>
+          <w:bCs/>
+        </w:rPr>
+        <w:t>Tier 1: Local Dashboards (For Channel Managers)</w:t>
+      </w:r>
+    </w:p>
+    <w:p>
+      <w:r>
+        <w:t>Each of the three portals above has its own minor, isolated dashboard view.</w:t>
+      </w:r>
+    </w:p>
+    <w:p>
+      <w:pPr>
+        <w:numPr>
+          <w:ilvl w:val="0"/>
+          <w:numId w:val="17"/>
+        </w:numPr>
+      </w:pPr>
+      <w:r>
+        <w:t xml:space="preserve">The </w:t>
+      </w:r>
+      <w:r>
+        <w:rPr>
+          <w:b/>
+          <w:bCs/>
+        </w:rPr>
+        <w:t>E-Commerce Manager</w:t>
+      </w:r>
+      <w:r>
+        <w:t xml:space="preserve"> only sees an analytics page tracking website clicks and online shopping carts.</w:t>
+      </w:r>
+    </w:p>
+    <w:p>
+      <w:pPr>
+        <w:numPr>
+          <w:ilvl w:val="0"/>
+          <w:numId w:val="17"/>
+        </w:numPr>
+      </w:pPr>
+      <w:r>
+        <w:t xml:space="preserve">The </w:t>
+      </w:r>
+      <w:r>
+        <w:rPr>
+          <w:b/>
+          <w:bCs/>
+        </w:rPr>
+        <w:t>Merchandising Manager</w:t>
+      </w:r>
+      <w:r>
+        <w:t xml:space="preserve"> only sees a page tracking large corporate store contracts.</w:t>
+      </w:r>
+    </w:p>
+    <w:p>
+      <w:pPr>
+        <w:numPr>
+          <w:ilvl w:val="0"/>
+          <w:numId w:val="17"/>
+        </w:numPr>
+      </w:pPr>
+      <w:r>
+        <w:t xml:space="preserve">The </w:t>
+      </w:r>
+      <w:r>
+        <w:rPr>
+          <w:b/>
+          <w:bCs/>
+        </w:rPr>
+        <w:t>Dealer Manager</w:t>
+      </w:r>
+      <w:r>
+        <w:t xml:space="preserve"> only sees warehouse stock speeds and shipping alerts.</w:t>
+      </w:r>
+    </w:p>
+    <w:p>
+      <w:pPr>
+        <w:rPr>
+          <w:b/>
+          <w:bCs/>
+        </w:rPr>
+      </w:pPr>
+      <w:r>
+        <w:rPr>
+          <w:b/>
+          <w:bCs/>
+        </w:rPr>
+        <w:t>Tier 2: The Master Dashboard (For the Big Boss / Admin)</w:t>
+      </w:r>
+    </w:p>
+    <w:p>
+      <w:r>
+        <w:t>This is your main dashboard (app.py)</w:t>
+      </w:r>
+    </w:p>
+    <w:p>
+      <w:pPr>
+        <w:numPr>
+          <w:ilvl w:val="0"/>
+          <w:numId w:val="18"/>
+        </w:numPr>
+      </w:pPr>
+      <w:r>
+        <w:rPr>
+          <w:b/>
+          <w:bCs/>
+        </w:rPr>
+        <w:lastRenderedPageBreak/>
+        <w:t>How it works:</w:t>
+      </w:r>
+      <w:r>
+        <w:t xml:space="preserve"> All three separate portals use the </w:t>
+      </w:r>
+      <w:r>
+        <w:rPr>
+          <w:b/>
+          <w:bCs/>
+        </w:rPr>
+        <w:t>Web API Gateway</w:t>
+      </w:r>
+      <w:r>
+        <w:t xml:space="preserve"> to send their individual sales data into </w:t>
+      </w:r>
+      <w:r>
+        <w:rPr>
+          <w:b/>
+          <w:bCs/>
+        </w:rPr>
+        <w:t>one single MySQL database</w:t>
+      </w:r>
+      <w:r>
+        <w:t xml:space="preserve"> (</w:t>
+      </w:r>
+      <w:proofErr w:type="spellStart"/>
+      <w:r>
+        <w:t>itc_sales_db</w:t>
+      </w:r>
+      <w:proofErr w:type="spellEnd"/>
+      <w:r>
+        <w:t xml:space="preserve">). </w:t>
+      </w:r>
+    </w:p>
+    <w:p>
+      <w:pPr>
+        <w:numPr>
+          <w:ilvl w:val="0"/>
+          <w:numId w:val="18"/>
+        </w:numPr>
+      </w:pPr>
+      <w:r>
+        <w:rPr>
+          <w:b/>
+          <w:bCs/>
+        </w:rPr>
+        <w:t>The View:</w:t>
+      </w:r>
+      <w:r>
+        <w:t xml:space="preserve"> When the Top Administrator or Executive opens this </w:t>
+      </w:r>
+      <w:r>
+        <w:rPr>
+          <w:b/>
+          <w:bCs/>
+        </w:rPr>
+        <w:t>Master Dashboard</w:t>
+      </w:r>
+      <w:r>
+        <w:t xml:space="preserve">, the system pulls data from the central database and shows </w:t>
+      </w:r>
+      <w:r>
+        <w:rPr>
+          <w:i/>
+          <w:iCs/>
+        </w:rPr>
+        <w:t>everything combined</w:t>
+      </w:r>
+      <w:r>
+        <w:t xml:space="preserve">. It allows the big boss to compare all three channels side-by-side and see exactly which one is making the company the most money. </w:t>
+      </w:r>
+    </w:p>
+    <w:p/>
     <w:p/>
     <w:p/>
     <w:sectPr>
@@ -1791,6 +3045,353 @@
 <file path=word/numbering.xml><?xml version="1.0" encoding="utf-8"?>
 <w:numbering xmlns:wpc="http://schemas.microsoft.com/office/word/2010/wordprocessingCanvas" xmlns:cx="http://schemas.microsoft.com/office/drawing/2014/chartex" xmlns:cx1="http://schemas.microsoft.com/office/drawing/2015/9/8/chartex" xmlns:cx2="http://schemas.microsoft.com/office/drawing/2015/10/21/chartex" xmlns:cx3="http://schemas.microsoft.com/office/drawing/2016/5/9/chartex" xmlns:cx4="http://schemas.microsoft.com/office/drawing/2016/5/10/chartex" xmlns:cx5="http://schemas.microsoft.com/office/drawing/2016/5/11/chartex" xmlns:cx6="http://schemas.microsoft.com/office/drawing/2016/5/12/chartex" xmlns:cx7="http://schemas.microsoft.com/office/drawing/2016/5/13/chartex" xmlns:cx8="http://schemas.microsoft.com/office/drawing/2016/5/14/chartex" xmlns:mc="http://schemas.openxmlformats.org/markup-compatibility/2006" xmlns:aink="http://schemas.microsoft.com/office/drawing/2016/ink" xmlns:am3d="http://schemas.microsoft.com/office/drawing/2017/model3d" xmlns:o="urn:schemas-microsoft-com:office:office" xmlns:oel="http://schemas.microsoft.com/office/2019/extlst" xmlns:r="http://schemas.openxmlformats.org/officeDocument/2006/relationships" xmlns:m="http://schemas.openxmlformats.org/officeDocument/2006/math" xmlns:v="urn:schemas-microsoft-com:vml" xmlns:wp14="http://schemas.microsoft.com/office/word/2010/wordprocessingDrawing" xmlns:wp="http://schemas.openxmlformats.org/drawingml/2006/wordprocessingDrawing" xmlns:w10="urn:schemas-microsoft-com:office:word" xmlns:w="http://schemas.openxmlformats.org/wordprocessingml/2006/main" xmlns:w14="http://schemas.microsoft.com/office/word/2010/wordml" xmlns:w15="http://schemas.microsoft.com/office/word/2012/wordml" xmlns:w16cex="http://schemas.microsoft.com/office/word/2018/wordml/cex" xmlns:w16cid="http://schemas.microsoft.com/office/word/2016/wordml/cid" xmlns:w16="http://schemas.microsoft.com/office/word/2018/wordml" xmlns:w16du="http://schemas.microsoft.com/office/word/2023/wordml/word16du" xmlns:w16sdtdh="http://schemas.microsoft.com/office/word/2020/wordml/sdtdatahash" xmlns:w16sdtfl="http://schemas.microsoft.com/office/word/2024/wordml/sdtformatlock" xmlns:w16se="http://schemas.microsoft.com/office/word/2015/wordml/symex" xmlns:wpg="http://schemas.microsoft.com/office/word/2010/wordprocessingGroup" xmlns:wpi="http://schemas.microsoft.com/office/word/2010/wordprocessingInk" xmlns:wne="http://schemas.microsoft.com/office/word/2006/wordml" xmlns:wps="http://schemas.microsoft.com/office/word/2010/wordprocessingShape" mc:Ignorable="w14 w15 w16se w16cid w16 w16cex w16sdtdh w16sdtfl w16du wp14">
   <w:abstractNum w:abstractNumId="0" w15:restartNumberingAfterBreak="0">
+    <w:nsid w:val="0AF92FE7"/>
+    <w:multiLevelType w:val="multilevel"/>
+    <w:tmpl w:val="E31A11C2"/>
+    <w:lvl w:ilvl="0">
+      <w:start w:val="1"/>
+      <w:numFmt w:val="decimal"/>
+      <w:lvlText w:val="%1."/>
+      <w:lvlJc w:val="left"/>
+      <w:pPr>
+        <w:tabs>
+          <w:tab w:val="num" w:pos="720"/>
+        </w:tabs>
+        <w:ind w:left="720" w:hanging="360"/>
+      </w:pPr>
+    </w:lvl>
+    <w:lvl w:ilvl="1">
+      <w:start w:val="1"/>
+      <w:numFmt w:val="bullet"/>
+      <w:lvlText w:val="o"/>
+      <w:lvlJc w:val="left"/>
+      <w:pPr>
+        <w:tabs>
+          <w:tab w:val="num" w:pos="1440"/>
+        </w:tabs>
+        <w:ind w:left="1440" w:hanging="360"/>
+      </w:pPr>
+      <w:rPr>
+        <w:rFonts w:ascii="Courier New" w:hAnsi="Courier New" w:hint="default"/>
+        <w:sz w:val="20"/>
+      </w:rPr>
+    </w:lvl>
+    <w:lvl w:ilvl="2" w:tentative="1">
+      <w:start w:val="1"/>
+      <w:numFmt w:val="decimal"/>
+      <w:lvlText w:val="%3."/>
+      <w:lvlJc w:val="left"/>
+      <w:pPr>
+        <w:tabs>
+          <w:tab w:val="num" w:pos="2160"/>
+        </w:tabs>
+        <w:ind w:left="2160" w:hanging="360"/>
+      </w:pPr>
+    </w:lvl>
+    <w:lvl w:ilvl="3" w:tentative="1">
+      <w:start w:val="1"/>
+      <w:numFmt w:val="decimal"/>
+      <w:lvlText w:val="%4."/>
+      <w:lvlJc w:val="left"/>
+      <w:pPr>
+        <w:tabs>
+          <w:tab w:val="num" w:pos="2880"/>
+        </w:tabs>
+        <w:ind w:left="2880" w:hanging="360"/>
+      </w:pPr>
+    </w:lvl>
+    <w:lvl w:ilvl="4" w:tentative="1">
+      <w:start w:val="1"/>
+      <w:numFmt w:val="decimal"/>
+      <w:lvlText w:val="%5."/>
+      <w:lvlJc w:val="left"/>
+      <w:pPr>
+        <w:tabs>
+          <w:tab w:val="num" w:pos="3600"/>
+        </w:tabs>
+        <w:ind w:left="3600" w:hanging="360"/>
+      </w:pPr>
+    </w:lvl>
+    <w:lvl w:ilvl="5" w:tentative="1">
+      <w:start w:val="1"/>
+      <w:numFmt w:val="decimal"/>
+      <w:lvlText w:val="%6."/>
+      <w:lvlJc w:val="left"/>
+      <w:pPr>
+        <w:tabs>
+          <w:tab w:val="num" w:pos="4320"/>
+        </w:tabs>
+        <w:ind w:left="4320" w:hanging="360"/>
+      </w:pPr>
+    </w:lvl>
+    <w:lvl w:ilvl="6" w:tentative="1">
+      <w:start w:val="1"/>
+      <w:numFmt w:val="decimal"/>
+      <w:lvlText w:val="%7."/>
+      <w:lvlJc w:val="left"/>
+      <w:pPr>
+        <w:tabs>
+          <w:tab w:val="num" w:pos="5040"/>
+        </w:tabs>
+        <w:ind w:left="5040" w:hanging="360"/>
+      </w:pPr>
+    </w:lvl>
+    <w:lvl w:ilvl="7" w:tentative="1">
+      <w:start w:val="1"/>
+      <w:numFmt w:val="decimal"/>
+      <w:lvlText w:val="%8."/>
+      <w:lvlJc w:val="left"/>
+      <w:pPr>
+        <w:tabs>
+          <w:tab w:val="num" w:pos="5760"/>
+        </w:tabs>
+        <w:ind w:left="5760" w:hanging="360"/>
+      </w:pPr>
+    </w:lvl>
+    <w:lvl w:ilvl="8" w:tentative="1">
+      <w:start w:val="1"/>
+      <w:numFmt w:val="decimal"/>
+      <w:lvlText w:val="%9."/>
+      <w:lvlJc w:val="left"/>
+      <w:pPr>
+        <w:tabs>
+          <w:tab w:val="num" w:pos="6480"/>
+        </w:tabs>
+        <w:ind w:left="6480" w:hanging="360"/>
+      </w:pPr>
+    </w:lvl>
+  </w:abstractNum>
+  <w:abstractNum w:abstractNumId="1" w15:restartNumberingAfterBreak="0">
+    <w:nsid w:val="0BE33C7B"/>
+    <w:multiLevelType w:val="multilevel"/>
+    <w:tmpl w:val="0FB2A254"/>
+    <w:lvl w:ilvl="0">
+      <w:start w:val="1"/>
+      <w:numFmt w:val="decimal"/>
+      <w:lvlText w:val="%1."/>
+      <w:lvlJc w:val="left"/>
+      <w:pPr>
+        <w:tabs>
+          <w:tab w:val="num" w:pos="720"/>
+        </w:tabs>
+        <w:ind w:left="720" w:hanging="360"/>
+      </w:pPr>
+    </w:lvl>
+    <w:lvl w:ilvl="1">
+      <w:start w:val="1"/>
+      <w:numFmt w:val="bullet"/>
+      <w:lvlText w:val="o"/>
+      <w:lvlJc w:val="left"/>
+      <w:pPr>
+        <w:tabs>
+          <w:tab w:val="num" w:pos="1440"/>
+        </w:tabs>
+        <w:ind w:left="1440" w:hanging="360"/>
+      </w:pPr>
+      <w:rPr>
+        <w:rFonts w:ascii="Courier New" w:hAnsi="Courier New" w:hint="default"/>
+        <w:sz w:val="20"/>
+      </w:rPr>
+    </w:lvl>
+    <w:lvl w:ilvl="2" w:tentative="1">
+      <w:start w:val="1"/>
+      <w:numFmt w:val="decimal"/>
+      <w:lvlText w:val="%3."/>
+      <w:lvlJc w:val="left"/>
+      <w:pPr>
+        <w:tabs>
+          <w:tab w:val="num" w:pos="2160"/>
+        </w:tabs>
+        <w:ind w:left="2160" w:hanging="360"/>
+      </w:pPr>
+    </w:lvl>
+    <w:lvl w:ilvl="3" w:tentative="1">
+      <w:start w:val="1"/>
+      <w:numFmt w:val="decimal"/>
+      <w:lvlText w:val="%4."/>
+      <w:lvlJc w:val="left"/>
+      <w:pPr>
+        <w:tabs>
+          <w:tab w:val="num" w:pos="2880"/>
+        </w:tabs>
+        <w:ind w:left="2880" w:hanging="360"/>
+      </w:pPr>
+    </w:lvl>
+    <w:lvl w:ilvl="4" w:tentative="1">
+      <w:start w:val="1"/>
+      <w:numFmt w:val="decimal"/>
+      <w:lvlText w:val="%5."/>
+      <w:lvlJc w:val="left"/>
+      <w:pPr>
+        <w:tabs>
+          <w:tab w:val="num" w:pos="3600"/>
+        </w:tabs>
+        <w:ind w:left="3600" w:hanging="360"/>
+      </w:pPr>
+    </w:lvl>
+    <w:lvl w:ilvl="5" w:tentative="1">
+      <w:start w:val="1"/>
+      <w:numFmt w:val="decimal"/>
+      <w:lvlText w:val="%6."/>
+      <w:lvlJc w:val="left"/>
+      <w:pPr>
+        <w:tabs>
+          <w:tab w:val="num" w:pos="4320"/>
+        </w:tabs>
+        <w:ind w:left="4320" w:hanging="360"/>
+      </w:pPr>
+    </w:lvl>
+    <w:lvl w:ilvl="6" w:tentative="1">
+      <w:start w:val="1"/>
+      <w:numFmt w:val="decimal"/>
+      <w:lvlText w:val="%7."/>
+      <w:lvlJc w:val="left"/>
+      <w:pPr>
+        <w:tabs>
+          <w:tab w:val="num" w:pos="5040"/>
+        </w:tabs>
+        <w:ind w:left="5040" w:hanging="360"/>
+      </w:pPr>
+    </w:lvl>
+    <w:lvl w:ilvl="7" w:tentative="1">
+      <w:start w:val="1"/>
+      <w:numFmt w:val="decimal"/>
+      <w:lvlText w:val="%8."/>
+      <w:lvlJc w:val="left"/>
+      <w:pPr>
+        <w:tabs>
+          <w:tab w:val="num" w:pos="5760"/>
+        </w:tabs>
+        <w:ind w:left="5760" w:hanging="360"/>
+      </w:pPr>
+    </w:lvl>
+    <w:lvl w:ilvl="8" w:tentative="1">
+      <w:start w:val="1"/>
+      <w:numFmt w:val="decimal"/>
+      <w:lvlText w:val="%9."/>
+      <w:lvlJc w:val="left"/>
+      <w:pPr>
+        <w:tabs>
+          <w:tab w:val="num" w:pos="6480"/>
+        </w:tabs>
+        <w:ind w:left="6480" w:hanging="360"/>
+      </w:pPr>
+    </w:lvl>
+  </w:abstractNum>
+  <w:abstractNum w:abstractNumId="2" w15:restartNumberingAfterBreak="0">
+    <w:nsid w:val="10541ECD"/>
+    <w:multiLevelType w:val="multilevel"/>
+    <w:tmpl w:val="B97A1780"/>
+    <w:lvl w:ilvl="0">
+      <w:start w:val="1"/>
+      <w:numFmt w:val="decimal"/>
+      <w:lvlText w:val="%1."/>
+      <w:lvlJc w:val="left"/>
+      <w:pPr>
+        <w:tabs>
+          <w:tab w:val="num" w:pos="720"/>
+        </w:tabs>
+        <w:ind w:left="720" w:hanging="360"/>
+      </w:pPr>
+    </w:lvl>
+    <w:lvl w:ilvl="1" w:tentative="1">
+      <w:start w:val="1"/>
+      <w:numFmt w:val="decimal"/>
+      <w:lvlText w:val="%2."/>
+      <w:lvlJc w:val="left"/>
+      <w:pPr>
+        <w:tabs>
+          <w:tab w:val="num" w:pos="1440"/>
+        </w:tabs>
+        <w:ind w:left="1440" w:hanging="360"/>
+      </w:pPr>
+    </w:lvl>
+    <w:lvl w:ilvl="2" w:tentative="1">
+      <w:start w:val="1"/>
+      <w:numFmt w:val="decimal"/>
+      <w:lvlText w:val="%3."/>
+      <w:lvlJc w:val="left"/>
+      <w:pPr>
+        <w:tabs>
+          <w:tab w:val="num" w:pos="2160"/>
+        </w:tabs>
+        <w:ind w:left="2160" w:hanging="360"/>
+      </w:pPr>
+    </w:lvl>
+    <w:lvl w:ilvl="3" w:tentative="1">
+      <w:start w:val="1"/>
+      <w:numFmt w:val="decimal"/>
+      <w:lvlText w:val="%4."/>
+      <w:lvlJc w:val="left"/>
+      <w:pPr>
+        <w:tabs>
+          <w:tab w:val="num" w:pos="2880"/>
+        </w:tabs>
+        <w:ind w:left="2880" w:hanging="360"/>
+      </w:pPr>
+    </w:lvl>
+    <w:lvl w:ilvl="4" w:tentative="1">
+      <w:start w:val="1"/>
+      <w:numFmt w:val="decimal"/>
+      <w:lvlText w:val="%5."/>
+      <w:lvlJc w:val="left"/>
+      <w:pPr>
+        <w:tabs>
+          <w:tab w:val="num" w:pos="3600"/>
+        </w:tabs>
+        <w:ind w:left="3600" w:hanging="360"/>
+      </w:pPr>
+    </w:lvl>
+    <w:lvl w:ilvl="5" w:tentative="1">
+      <w:start w:val="1"/>
+      <w:numFmt w:val="decimal"/>
+      <w:lvlText w:val="%6."/>
+      <w:lvlJc w:val="left"/>
+      <w:pPr>
+        <w:tabs>
+          <w:tab w:val="num" w:pos="4320"/>
+        </w:tabs>
+        <w:ind w:left="4320" w:hanging="360"/>
+      </w:pPr>
+    </w:lvl>
+    <w:lvl w:ilvl="6" w:tentative="1">
+      <w:start w:val="1"/>
+      <w:numFmt w:val="decimal"/>
+      <w:lvlText w:val="%7."/>
+      <w:lvlJc w:val="left"/>
+      <w:pPr>
+        <w:tabs>
+          <w:tab w:val="num" w:pos="5040"/>
+        </w:tabs>
+        <w:ind w:left="5040" w:hanging="360"/>
+      </w:pPr>
+    </w:lvl>
+    <w:lvl w:ilvl="7" w:tentative="1">
+      <w:start w:val="1"/>
+      <w:numFmt w:val="decimal"/>
+      <w:lvlText w:val="%8."/>
+      <w:lvlJc w:val="left"/>
+      <w:pPr>
+        <w:tabs>
+          <w:tab w:val="num" w:pos="5760"/>
+        </w:tabs>
+        <w:ind w:left="5760" w:hanging="360"/>
+      </w:pPr>
+    </w:lvl>
+    <w:lvl w:ilvl="8" w:tentative="1">
+      <w:start w:val="1"/>
+      <w:numFmt w:val="decimal"/>
+      <w:lvlText w:val="%9."/>
+      <w:lvlJc w:val="left"/>
+      <w:pPr>
+        <w:tabs>
+          <w:tab w:val="num" w:pos="6480"/>
+        </w:tabs>
+        <w:ind w:left="6480" w:hanging="360"/>
+      </w:pPr>
+    </w:lvl>
+  </w:abstractNum>
+  <w:abstractNum w:abstractNumId="3" w15:restartNumberingAfterBreak="0">
     <w:nsid w:val="121902E2"/>
     <w:multiLevelType w:val="multilevel"/>
     <w:tmpl w:val="90C2DB86"/>
@@ -1903,7 +3504,7 @@
       </w:pPr>
     </w:lvl>
   </w:abstractNum>
-  <w:abstractNum w:abstractNumId="1" w15:restartNumberingAfterBreak="0">
+  <w:abstractNum w:abstractNumId="4" w15:restartNumberingAfterBreak="0">
     <w:nsid w:val="143A2DA1"/>
     <w:multiLevelType w:val="multilevel"/>
     <w:tmpl w:val="5E54523A"/>
@@ -2052,7 +3653,7 @@
       </w:rPr>
     </w:lvl>
   </w:abstractNum>
-  <w:abstractNum w:abstractNumId="2" w15:restartNumberingAfterBreak="0">
+  <w:abstractNum w:abstractNumId="5" w15:restartNumberingAfterBreak="0">
     <w:nsid w:val="15C96702"/>
     <w:multiLevelType w:val="multilevel"/>
     <w:tmpl w:val="1124FC08"/>
@@ -2201,7 +3802,7 @@
       </w:rPr>
     </w:lvl>
   </w:abstractNum>
-  <w:abstractNum w:abstractNumId="3" w15:restartNumberingAfterBreak="0">
+  <w:abstractNum w:abstractNumId="6" w15:restartNumberingAfterBreak="0">
     <w:nsid w:val="168A733E"/>
     <w:multiLevelType w:val="multilevel"/>
     <w:tmpl w:val="C660FC4E"/>
@@ -2350,7 +3951,269 @@
       </w:rPr>
     </w:lvl>
   </w:abstractNum>
-  <w:abstractNum w:abstractNumId="4" w15:restartNumberingAfterBreak="0">
+  <w:abstractNum w:abstractNumId="7" w15:restartNumberingAfterBreak="0">
+    <w:nsid w:val="21143492"/>
+    <w:multiLevelType w:val="multilevel"/>
+    <w:tmpl w:val="E56AD368"/>
+    <w:lvl w:ilvl="0">
+      <w:start w:val="1"/>
+      <w:numFmt w:val="bullet"/>
+      <w:lvlText w:val=""/>
+      <w:lvlJc w:val="left"/>
+      <w:pPr>
+        <w:tabs>
+          <w:tab w:val="num" w:pos="720"/>
+        </w:tabs>
+        <w:ind w:left="720" w:hanging="360"/>
+      </w:pPr>
+      <w:rPr>
+        <w:rFonts w:ascii="Symbol" w:hAnsi="Symbol" w:hint="default"/>
+        <w:sz w:val="20"/>
+      </w:rPr>
+    </w:lvl>
+    <w:lvl w:ilvl="1" w:tentative="1">
+      <w:start w:val="1"/>
+      <w:numFmt w:val="bullet"/>
+      <w:lvlText w:val="o"/>
+      <w:lvlJc w:val="left"/>
+      <w:pPr>
+        <w:tabs>
+          <w:tab w:val="num" w:pos="1440"/>
+        </w:tabs>
+        <w:ind w:left="1440" w:hanging="360"/>
+      </w:pPr>
+      <w:rPr>
+        <w:rFonts w:ascii="Courier New" w:hAnsi="Courier New" w:hint="default"/>
+        <w:sz w:val="20"/>
+      </w:rPr>
+    </w:lvl>
+    <w:lvl w:ilvl="2" w:tentative="1">
+      <w:start w:val="1"/>
+      <w:numFmt w:val="bullet"/>
+      <w:lvlText w:val=""/>
+      <w:lvlJc w:val="left"/>
+      <w:pPr>
+        <w:tabs>
+          <w:tab w:val="num" w:pos="2160"/>
+        </w:tabs>
+        <w:ind w:left="2160" w:hanging="360"/>
+      </w:pPr>
+      <w:rPr>
+        <w:rFonts w:ascii="Wingdings" w:hAnsi="Wingdings" w:hint="default"/>
+        <w:sz w:val="20"/>
+      </w:rPr>
+    </w:lvl>
+    <w:lvl w:ilvl="3" w:tentative="1">
+      <w:start w:val="1"/>
+      <w:numFmt w:val="bullet"/>
+      <w:lvlText w:val=""/>
+      <w:lvlJc w:val="left"/>
+      <w:pPr>
+        <w:tabs>
+          <w:tab w:val="num" w:pos="2880"/>
+        </w:tabs>
+        <w:ind w:left="2880" w:hanging="360"/>
+      </w:pPr>
+      <w:rPr>
+        <w:rFonts w:ascii="Wingdings" w:hAnsi="Wingdings" w:hint="default"/>
+        <w:sz w:val="20"/>
+      </w:rPr>
+    </w:lvl>
+    <w:lvl w:ilvl="4" w:tentative="1">
+      <w:start w:val="1"/>
+      <w:numFmt w:val="bullet"/>
+      <w:lvlText w:val=""/>
+      <w:lvlJc w:val="left"/>
+      <w:pPr>
+        <w:tabs>
+          <w:tab w:val="num" w:pos="3600"/>
+        </w:tabs>
+        <w:ind w:left="3600" w:hanging="360"/>
+      </w:pPr>
+      <w:rPr>
+        <w:rFonts w:ascii="Wingdings" w:hAnsi="Wingdings" w:hint="default"/>
+        <w:sz w:val="20"/>
+      </w:rPr>
+    </w:lvl>
+    <w:lvl w:ilvl="5" w:tentative="1">
+      <w:start w:val="1"/>
+      <w:numFmt w:val="bullet"/>
+      <w:lvlText w:val=""/>
+      <w:lvlJc w:val="left"/>
+      <w:pPr>
+        <w:tabs>
+          <w:tab w:val="num" w:pos="4320"/>
+        </w:tabs>
+        <w:ind w:left="4320" w:hanging="360"/>
+      </w:pPr>
+      <w:rPr>
+        <w:rFonts w:ascii="Wingdings" w:hAnsi="Wingdings" w:hint="default"/>
+        <w:sz w:val="20"/>
+      </w:rPr>
+    </w:lvl>
+    <w:lvl w:ilvl="6" w:tentative="1">
+      <w:start w:val="1"/>
+      <w:numFmt w:val="bullet"/>
+      <w:lvlText w:val=""/>
+      <w:lvlJc w:val="left"/>
+      <w:pPr>
+        <w:tabs>
+          <w:tab w:val="num" w:pos="5040"/>
+        </w:tabs>
+        <w:ind w:left="5040" w:hanging="360"/>
+      </w:pPr>
+      <w:rPr>
+        <w:rFonts w:ascii="Wingdings" w:hAnsi="Wingdings" w:hint="default"/>
+        <w:sz w:val="20"/>
+      </w:rPr>
+    </w:lvl>
+    <w:lvl w:ilvl="7" w:tentative="1">
+      <w:start w:val="1"/>
+      <w:numFmt w:val="bullet"/>
+      <w:lvlText w:val=""/>
+      <w:lvlJc w:val="left"/>
+      <w:pPr>
+        <w:tabs>
+          <w:tab w:val="num" w:pos="5760"/>
+        </w:tabs>
+        <w:ind w:left="5760" w:hanging="360"/>
+      </w:pPr>
+      <w:rPr>
+        <w:rFonts w:ascii="Wingdings" w:hAnsi="Wingdings" w:hint="default"/>
+        <w:sz w:val="20"/>
+      </w:rPr>
+    </w:lvl>
+    <w:lvl w:ilvl="8" w:tentative="1">
+      <w:start w:val="1"/>
+      <w:numFmt w:val="bullet"/>
+      <w:lvlText w:val=""/>
+      <w:lvlJc w:val="left"/>
+      <w:pPr>
+        <w:tabs>
+          <w:tab w:val="num" w:pos="6480"/>
+        </w:tabs>
+        <w:ind w:left="6480" w:hanging="360"/>
+      </w:pPr>
+      <w:rPr>
+        <w:rFonts w:ascii="Wingdings" w:hAnsi="Wingdings" w:hint="default"/>
+        <w:sz w:val="20"/>
+      </w:rPr>
+    </w:lvl>
+  </w:abstractNum>
+  <w:abstractNum w:abstractNumId="8" w15:restartNumberingAfterBreak="0">
+    <w:nsid w:val="24B02454"/>
+    <w:multiLevelType w:val="multilevel"/>
+    <w:tmpl w:val="C62AB620"/>
+    <w:lvl w:ilvl="0">
+      <w:start w:val="1"/>
+      <w:numFmt w:val="decimal"/>
+      <w:lvlText w:val="%1."/>
+      <w:lvlJc w:val="left"/>
+      <w:pPr>
+        <w:tabs>
+          <w:tab w:val="num" w:pos="720"/>
+        </w:tabs>
+        <w:ind w:left="720" w:hanging="360"/>
+      </w:pPr>
+    </w:lvl>
+    <w:lvl w:ilvl="1" w:tentative="1">
+      <w:start w:val="1"/>
+      <w:numFmt w:val="decimal"/>
+      <w:lvlText w:val="%2."/>
+      <w:lvlJc w:val="left"/>
+      <w:pPr>
+        <w:tabs>
+          <w:tab w:val="num" w:pos="1440"/>
+        </w:tabs>
+        <w:ind w:left="1440" w:hanging="360"/>
+      </w:pPr>
+    </w:lvl>
+    <w:lvl w:ilvl="2" w:tentative="1">
+      <w:start w:val="1"/>
+      <w:numFmt w:val="decimal"/>
+      <w:lvlText w:val="%3."/>
+      <w:lvlJc w:val="left"/>
+      <w:pPr>
+        <w:tabs>
+          <w:tab w:val="num" w:pos="2160"/>
+        </w:tabs>
+        <w:ind w:left="2160" w:hanging="360"/>
+      </w:pPr>
+    </w:lvl>
+    <w:lvl w:ilvl="3" w:tentative="1">
+      <w:start w:val="1"/>
+      <w:numFmt w:val="decimal"/>
+      <w:lvlText w:val="%4."/>
+      <w:lvlJc w:val="left"/>
+      <w:pPr>
+        <w:tabs>
+          <w:tab w:val="num" w:pos="2880"/>
+        </w:tabs>
+        <w:ind w:left="2880" w:hanging="360"/>
+      </w:pPr>
+    </w:lvl>
+    <w:lvl w:ilvl="4" w:tentative="1">
+      <w:start w:val="1"/>
+      <w:numFmt w:val="decimal"/>
+      <w:lvlText w:val="%5."/>
+      <w:lvlJc w:val="left"/>
+      <w:pPr>
+        <w:tabs>
+          <w:tab w:val="num" w:pos="3600"/>
+        </w:tabs>
+        <w:ind w:left="3600" w:hanging="360"/>
+      </w:pPr>
+    </w:lvl>
+    <w:lvl w:ilvl="5" w:tentative="1">
+      <w:start w:val="1"/>
+      <w:numFmt w:val="decimal"/>
+      <w:lvlText w:val="%6."/>
+      <w:lvlJc w:val="left"/>
+      <w:pPr>
+        <w:tabs>
+          <w:tab w:val="num" w:pos="4320"/>
+        </w:tabs>
+        <w:ind w:left="4320" w:hanging="360"/>
+      </w:pPr>
+    </w:lvl>
+    <w:lvl w:ilvl="6" w:tentative="1">
+      <w:start w:val="1"/>
+      <w:numFmt w:val="decimal"/>
+      <w:lvlText w:val="%7."/>
+      <w:lvlJc w:val="left"/>
+      <w:pPr>
+        <w:tabs>
+          <w:tab w:val="num" w:pos="5040"/>
+        </w:tabs>
+        <w:ind w:left="5040" w:hanging="360"/>
+      </w:pPr>
+    </w:lvl>
+    <w:lvl w:ilvl="7" w:tentative="1">
+      <w:start w:val="1"/>
+      <w:numFmt w:val="decimal"/>
+      <w:lvlText w:val="%8."/>
+      <w:lvlJc w:val="left"/>
+      <w:pPr>
+        <w:tabs>
+          <w:tab w:val="num" w:pos="5760"/>
+        </w:tabs>
+        <w:ind w:left="5760" w:hanging="360"/>
+      </w:pPr>
+    </w:lvl>
+    <w:lvl w:ilvl="8" w:tentative="1">
+      <w:start w:val="1"/>
+      <w:numFmt w:val="decimal"/>
+      <w:lvlText w:val="%9."/>
+      <w:lvlJc w:val="left"/>
+      <w:pPr>
+        <w:tabs>
+          <w:tab w:val="num" w:pos="6480"/>
+        </w:tabs>
+        <w:ind w:left="6480" w:hanging="360"/>
+      </w:pPr>
+    </w:lvl>
+  </w:abstractNum>
+  <w:abstractNum w:abstractNumId="9" w15:restartNumberingAfterBreak="0">
     <w:nsid w:val="347705D0"/>
     <w:multiLevelType w:val="multilevel"/>
     <w:tmpl w:val="4BD6C7F0"/>
@@ -2495,7 +4358,269 @@
       </w:rPr>
     </w:lvl>
   </w:abstractNum>
-  <w:abstractNum w:abstractNumId="5" w15:restartNumberingAfterBreak="0">
+  <w:abstractNum w:abstractNumId="10" w15:restartNumberingAfterBreak="0">
+    <w:nsid w:val="3907078D"/>
+    <w:multiLevelType w:val="multilevel"/>
+    <w:tmpl w:val="AFAE13B4"/>
+    <w:lvl w:ilvl="0">
+      <w:start w:val="1"/>
+      <w:numFmt w:val="bullet"/>
+      <w:lvlText w:val=""/>
+      <w:lvlJc w:val="left"/>
+      <w:pPr>
+        <w:tabs>
+          <w:tab w:val="num" w:pos="720"/>
+        </w:tabs>
+        <w:ind w:left="720" w:hanging="360"/>
+      </w:pPr>
+      <w:rPr>
+        <w:rFonts w:ascii="Symbol" w:hAnsi="Symbol" w:hint="default"/>
+        <w:sz w:val="20"/>
+      </w:rPr>
+    </w:lvl>
+    <w:lvl w:ilvl="1" w:tentative="1">
+      <w:start w:val="1"/>
+      <w:numFmt w:val="bullet"/>
+      <w:lvlText w:val="o"/>
+      <w:lvlJc w:val="left"/>
+      <w:pPr>
+        <w:tabs>
+          <w:tab w:val="num" w:pos="1440"/>
+        </w:tabs>
+        <w:ind w:left="1440" w:hanging="360"/>
+      </w:pPr>
+      <w:rPr>
+        <w:rFonts w:ascii="Courier New" w:hAnsi="Courier New" w:hint="default"/>
+        <w:sz w:val="20"/>
+      </w:rPr>
+    </w:lvl>
+    <w:lvl w:ilvl="2" w:tentative="1">
+      <w:start w:val="1"/>
+      <w:numFmt w:val="bullet"/>
+      <w:lvlText w:val=""/>
+      <w:lvlJc w:val="left"/>
+      <w:pPr>
+        <w:tabs>
+          <w:tab w:val="num" w:pos="2160"/>
+        </w:tabs>
+        <w:ind w:left="2160" w:hanging="360"/>
+      </w:pPr>
+      <w:rPr>
+        <w:rFonts w:ascii="Wingdings" w:hAnsi="Wingdings" w:hint="default"/>
+        <w:sz w:val="20"/>
+      </w:rPr>
+    </w:lvl>
+    <w:lvl w:ilvl="3" w:tentative="1">
+      <w:start w:val="1"/>
+      <w:numFmt w:val="bullet"/>
+      <w:lvlText w:val=""/>
+      <w:lvlJc w:val="left"/>
+      <w:pPr>
+        <w:tabs>
+          <w:tab w:val="num" w:pos="2880"/>
+        </w:tabs>
+        <w:ind w:left="2880" w:hanging="360"/>
+      </w:pPr>
+      <w:rPr>
+        <w:rFonts w:ascii="Wingdings" w:hAnsi="Wingdings" w:hint="default"/>
+        <w:sz w:val="20"/>
+      </w:rPr>
+    </w:lvl>
+    <w:lvl w:ilvl="4" w:tentative="1">
+      <w:start w:val="1"/>
+      <w:numFmt w:val="bullet"/>
+      <w:lvlText w:val=""/>
+      <w:lvlJc w:val="left"/>
+      <w:pPr>
+        <w:tabs>
+          <w:tab w:val="num" w:pos="3600"/>
+        </w:tabs>
+        <w:ind w:left="3600" w:hanging="360"/>
+      </w:pPr>
+      <w:rPr>
+        <w:rFonts w:ascii="Wingdings" w:hAnsi="Wingdings" w:hint="default"/>
+        <w:sz w:val="20"/>
+      </w:rPr>
+    </w:lvl>
+    <w:lvl w:ilvl="5" w:tentative="1">
+      <w:start w:val="1"/>
+      <w:numFmt w:val="bullet"/>
+      <w:lvlText w:val=""/>
+      <w:lvlJc w:val="left"/>
+      <w:pPr>
+        <w:tabs>
+          <w:tab w:val="num" w:pos="4320"/>
+        </w:tabs>
+        <w:ind w:left="4320" w:hanging="360"/>
+      </w:pPr>
+      <w:rPr>
+        <w:rFonts w:ascii="Wingdings" w:hAnsi="Wingdings" w:hint="default"/>
+        <w:sz w:val="20"/>
+      </w:rPr>
+    </w:lvl>
+    <w:lvl w:ilvl="6" w:tentative="1">
+      <w:start w:val="1"/>
+      <w:numFmt w:val="bullet"/>
+      <w:lvlText w:val=""/>
+      <w:lvlJc w:val="left"/>
+      <w:pPr>
+        <w:tabs>
+          <w:tab w:val="num" w:pos="5040"/>
+        </w:tabs>
+        <w:ind w:left="5040" w:hanging="360"/>
+      </w:pPr>
+      <w:rPr>
+        <w:rFonts w:ascii="Wingdings" w:hAnsi="Wingdings" w:hint="default"/>
+        <w:sz w:val="20"/>
+      </w:rPr>
+    </w:lvl>
+    <w:lvl w:ilvl="7" w:tentative="1">
+      <w:start w:val="1"/>
+      <w:numFmt w:val="bullet"/>
+      <w:lvlText w:val=""/>
+      <w:lvlJc w:val="left"/>
+      <w:pPr>
+        <w:tabs>
+          <w:tab w:val="num" w:pos="5760"/>
+        </w:tabs>
+        <w:ind w:left="5760" w:hanging="360"/>
+      </w:pPr>
+      <w:rPr>
+        <w:rFonts w:ascii="Wingdings" w:hAnsi="Wingdings" w:hint="default"/>
+        <w:sz w:val="20"/>
+      </w:rPr>
+    </w:lvl>
+    <w:lvl w:ilvl="8" w:tentative="1">
+      <w:start w:val="1"/>
+      <w:numFmt w:val="bullet"/>
+      <w:lvlText w:val=""/>
+      <w:lvlJc w:val="left"/>
+      <w:pPr>
+        <w:tabs>
+          <w:tab w:val="num" w:pos="6480"/>
+        </w:tabs>
+        <w:ind w:left="6480" w:hanging="360"/>
+      </w:pPr>
+      <w:rPr>
+        <w:rFonts w:ascii="Wingdings" w:hAnsi="Wingdings" w:hint="default"/>
+        <w:sz w:val="20"/>
+      </w:rPr>
+    </w:lvl>
+  </w:abstractNum>
+  <w:abstractNum w:abstractNumId="11" w15:restartNumberingAfterBreak="0">
+    <w:nsid w:val="4050737B"/>
+    <w:multiLevelType w:val="multilevel"/>
+    <w:tmpl w:val="149863D4"/>
+    <w:lvl w:ilvl="0">
+      <w:start w:val="1"/>
+      <w:numFmt w:val="decimal"/>
+      <w:lvlText w:val="%1."/>
+      <w:lvlJc w:val="left"/>
+      <w:pPr>
+        <w:tabs>
+          <w:tab w:val="num" w:pos="720"/>
+        </w:tabs>
+        <w:ind w:left="720" w:hanging="360"/>
+      </w:pPr>
+    </w:lvl>
+    <w:lvl w:ilvl="1" w:tentative="1">
+      <w:start w:val="1"/>
+      <w:numFmt w:val="decimal"/>
+      <w:lvlText w:val="%2."/>
+      <w:lvlJc w:val="left"/>
+      <w:pPr>
+        <w:tabs>
+          <w:tab w:val="num" w:pos="1440"/>
+        </w:tabs>
+        <w:ind w:left="1440" w:hanging="360"/>
+      </w:pPr>
+    </w:lvl>
+    <w:lvl w:ilvl="2" w:tentative="1">
+      <w:start w:val="1"/>
+      <w:numFmt w:val="decimal"/>
+      <w:lvlText w:val="%3."/>
+      <w:lvlJc w:val="left"/>
+      <w:pPr>
+        <w:tabs>
+          <w:tab w:val="num" w:pos="2160"/>
+        </w:tabs>
+        <w:ind w:left="2160" w:hanging="360"/>
+      </w:pPr>
+    </w:lvl>
+    <w:lvl w:ilvl="3" w:tentative="1">
+      <w:start w:val="1"/>
+      <w:numFmt w:val="decimal"/>
+      <w:lvlText w:val="%4."/>
+      <w:lvlJc w:val="left"/>
+      <w:pPr>
+        <w:tabs>
+          <w:tab w:val="num" w:pos="2880"/>
+        </w:tabs>
+        <w:ind w:left="2880" w:hanging="360"/>
+      </w:pPr>
+    </w:lvl>
+    <w:lvl w:ilvl="4" w:tentative="1">
+      <w:start w:val="1"/>
+      <w:numFmt w:val="decimal"/>
+      <w:lvlText w:val="%5."/>
+      <w:lvlJc w:val="left"/>
+      <w:pPr>
+        <w:tabs>
+          <w:tab w:val="num" w:pos="3600"/>
+        </w:tabs>
+        <w:ind w:left="3600" w:hanging="360"/>
+      </w:pPr>
+    </w:lvl>
+    <w:lvl w:ilvl="5" w:tentative="1">
+      <w:start w:val="1"/>
+      <w:numFmt w:val="decimal"/>
+      <w:lvlText w:val="%6."/>
+      <w:lvlJc w:val="left"/>
+      <w:pPr>
+        <w:tabs>
+          <w:tab w:val="num" w:pos="4320"/>
+        </w:tabs>
+        <w:ind w:left="4320" w:hanging="360"/>
+      </w:pPr>
+    </w:lvl>
+    <w:lvl w:ilvl="6" w:tentative="1">
+      <w:start w:val="1"/>
+      <w:numFmt w:val="decimal"/>
+      <w:lvlText w:val="%7."/>
+      <w:lvlJc w:val="left"/>
+      <w:pPr>
+        <w:tabs>
+          <w:tab w:val="num" w:pos="5040"/>
+        </w:tabs>
+        <w:ind w:left="5040" w:hanging="360"/>
+      </w:pPr>
+    </w:lvl>
+    <w:lvl w:ilvl="7" w:tentative="1">
+      <w:start w:val="1"/>
+      <w:numFmt w:val="decimal"/>
+      <w:lvlText w:val="%8."/>
+      <w:lvlJc w:val="left"/>
+      <w:pPr>
+        <w:tabs>
+          <w:tab w:val="num" w:pos="5760"/>
+        </w:tabs>
+        <w:ind w:left="5760" w:hanging="360"/>
+      </w:pPr>
+    </w:lvl>
+    <w:lvl w:ilvl="8" w:tentative="1">
+      <w:start w:val="1"/>
+      <w:numFmt w:val="decimal"/>
+      <w:lvlText w:val="%9."/>
+      <w:lvlJc w:val="left"/>
+      <w:pPr>
+        <w:tabs>
+          <w:tab w:val="num" w:pos="6480"/>
+        </w:tabs>
+        <w:ind w:left="6480" w:hanging="360"/>
+      </w:pPr>
+    </w:lvl>
+  </w:abstractNum>
+  <w:abstractNum w:abstractNumId="12" w15:restartNumberingAfterBreak="0">
     <w:nsid w:val="43886FE3"/>
     <w:multiLevelType w:val="multilevel"/>
     <w:tmpl w:val="2FEE1106"/>
@@ -2644,7 +4769,7 @@
       </w:rPr>
     </w:lvl>
   </w:abstractNum>
-  <w:abstractNum w:abstractNumId="6" w15:restartNumberingAfterBreak="0">
+  <w:abstractNum w:abstractNumId="13" w15:restartNumberingAfterBreak="0">
     <w:nsid w:val="4E5D1262"/>
     <w:multiLevelType w:val="multilevel"/>
     <w:tmpl w:val="B87A8FB8"/>
@@ -2793,7 +4918,156 @@
       </w:rPr>
     </w:lvl>
   </w:abstractNum>
-  <w:abstractNum w:abstractNumId="7" w15:restartNumberingAfterBreak="0">
+  <w:abstractNum w:abstractNumId="14" w15:restartNumberingAfterBreak="0">
+    <w:nsid w:val="530A78DB"/>
+    <w:multiLevelType w:val="multilevel"/>
+    <w:tmpl w:val="9AB2220C"/>
+    <w:lvl w:ilvl="0">
+      <w:start w:val="1"/>
+      <w:numFmt w:val="bullet"/>
+      <w:lvlText w:val=""/>
+      <w:lvlJc w:val="left"/>
+      <w:pPr>
+        <w:tabs>
+          <w:tab w:val="num" w:pos="720"/>
+        </w:tabs>
+        <w:ind w:left="720" w:hanging="360"/>
+      </w:pPr>
+      <w:rPr>
+        <w:rFonts w:ascii="Symbol" w:hAnsi="Symbol" w:hint="default"/>
+        <w:sz w:val="20"/>
+      </w:rPr>
+    </w:lvl>
+    <w:lvl w:ilvl="1" w:tentative="1">
+      <w:start w:val="1"/>
+      <w:numFmt w:val="bullet"/>
+      <w:lvlText w:val="o"/>
+      <w:lvlJc w:val="left"/>
+      <w:pPr>
+        <w:tabs>
+          <w:tab w:val="num" w:pos="1440"/>
+        </w:tabs>
+        <w:ind w:left="1440" w:hanging="360"/>
+      </w:pPr>
+      <w:rPr>
+        <w:rFonts w:ascii="Courier New" w:hAnsi="Courier New" w:hint="default"/>
+        <w:sz w:val="20"/>
+      </w:rPr>
+    </w:lvl>
+    <w:lvl w:ilvl="2" w:tentative="1">
+      <w:start w:val="1"/>
+      <w:numFmt w:val="bullet"/>
+      <w:lvlText w:val=""/>
+      <w:lvlJc w:val="left"/>
+      <w:pPr>
+        <w:tabs>
+          <w:tab w:val="num" w:pos="2160"/>
+        </w:tabs>
+        <w:ind w:left="2160" w:hanging="360"/>
+      </w:pPr>
+      <w:rPr>
+        <w:rFonts w:ascii="Wingdings" w:hAnsi="Wingdings" w:hint="default"/>
+        <w:sz w:val="20"/>
+      </w:rPr>
+    </w:lvl>
+    <w:lvl w:ilvl="3" w:tentative="1">
+      <w:start w:val="1"/>
+      <w:numFmt w:val="bullet"/>
+      <w:lvlText w:val=""/>
+      <w:lvlJc w:val="left"/>
+      <w:pPr>
+        <w:tabs>
+          <w:tab w:val="num" w:pos="2880"/>
+        </w:tabs>
+        <w:ind w:left="2880" w:hanging="360"/>
+      </w:pPr>
+      <w:rPr>
+        <w:rFonts w:ascii="Wingdings" w:hAnsi="Wingdings" w:hint="default"/>
+        <w:sz w:val="20"/>
+      </w:rPr>
+    </w:lvl>
+    <w:lvl w:ilvl="4" w:tentative="1">
+      <w:start w:val="1"/>
+      <w:numFmt w:val="bullet"/>
+      <w:lvlText w:val=""/>
+      <w:lvlJc w:val="left"/>
+      <w:pPr>
+        <w:tabs>
+          <w:tab w:val="num" w:pos="3600"/>
+        </w:tabs>
+        <w:ind w:left="3600" w:hanging="360"/>
+      </w:pPr>
+      <w:rPr>
+        <w:rFonts w:ascii="Wingdings" w:hAnsi="Wingdings" w:hint="default"/>
+        <w:sz w:val="20"/>
+      </w:rPr>
+    </w:lvl>
+    <w:lvl w:ilvl="5" w:tentative="1">
+      <w:start w:val="1"/>
+      <w:numFmt w:val="bullet"/>
+      <w:lvlText w:val=""/>
+      <w:lvlJc w:val="left"/>
+      <w:pPr>
+        <w:tabs>
+          <w:tab w:val="num" w:pos="4320"/>
+        </w:tabs>
+        <w:ind w:left="4320" w:hanging="360"/>
+      </w:pPr>
+      <w:rPr>
+        <w:rFonts w:ascii="Wingdings" w:hAnsi="Wingdings" w:hint="default"/>
+        <w:sz w:val="20"/>
+      </w:rPr>
+    </w:lvl>
+    <w:lvl w:ilvl="6" w:tentative="1">
+      <w:start w:val="1"/>
+      <w:numFmt w:val="bullet"/>
+      <w:lvlText w:val=""/>
+      <w:lvlJc w:val="left"/>
+      <w:pPr>
+        <w:tabs>
+          <w:tab w:val="num" w:pos="5040"/>
+        </w:tabs>
+        <w:ind w:left="5040" w:hanging="360"/>
+      </w:pPr>
+      <w:rPr>
+        <w:rFonts w:ascii="Wingdings" w:hAnsi="Wingdings" w:hint="default"/>
+        <w:sz w:val="20"/>
+      </w:rPr>
+    </w:lvl>
+    <w:lvl w:ilvl="7" w:tentative="1">
+      <w:start w:val="1"/>
+      <w:numFmt w:val="bullet"/>
+      <w:lvlText w:val=""/>
+      <w:lvlJc w:val="left"/>
+      <w:pPr>
+        <w:tabs>
+          <w:tab w:val="num" w:pos="5760"/>
+        </w:tabs>
+        <w:ind w:left="5760" w:hanging="360"/>
+      </w:pPr>
+      <w:rPr>
+        <w:rFonts w:ascii="Wingdings" w:hAnsi="Wingdings" w:hint="default"/>
+        <w:sz w:val="20"/>
+      </w:rPr>
+    </w:lvl>
+    <w:lvl w:ilvl="8" w:tentative="1">
+      <w:start w:val="1"/>
+      <w:numFmt w:val="bullet"/>
+      <w:lvlText w:val=""/>
+      <w:lvlJc w:val="left"/>
+      <w:pPr>
+        <w:tabs>
+          <w:tab w:val="num" w:pos="6480"/>
+        </w:tabs>
+        <w:ind w:left="6480" w:hanging="360"/>
+      </w:pPr>
+      <w:rPr>
+        <w:rFonts w:ascii="Wingdings" w:hAnsi="Wingdings" w:hint="default"/>
+        <w:sz w:val="20"/>
+      </w:rPr>
+    </w:lvl>
+  </w:abstractNum>
+  <w:abstractNum w:abstractNumId="15" w15:restartNumberingAfterBreak="0">
     <w:nsid w:val="53344B6F"/>
     <w:multiLevelType w:val="multilevel"/>
     <w:tmpl w:val="2C8A04A8"/>
@@ -2942,29 +5216,321 @@
       </w:rPr>
     </w:lvl>
   </w:abstractNum>
+  <w:abstractNum w:abstractNumId="16" w15:restartNumberingAfterBreak="0">
+    <w:nsid w:val="661155B2"/>
+    <w:multiLevelType w:val="multilevel"/>
+    <w:tmpl w:val="BB00A2E6"/>
+    <w:lvl w:ilvl="0">
+      <w:start w:val="1"/>
+      <w:numFmt w:val="decimal"/>
+      <w:lvlText w:val="%1."/>
+      <w:lvlJc w:val="left"/>
+      <w:pPr>
+        <w:tabs>
+          <w:tab w:val="num" w:pos="720"/>
+        </w:tabs>
+        <w:ind w:left="720" w:hanging="360"/>
+      </w:pPr>
+    </w:lvl>
+    <w:lvl w:ilvl="1" w:tentative="1">
+      <w:start w:val="1"/>
+      <w:numFmt w:val="decimal"/>
+      <w:lvlText w:val="%2."/>
+      <w:lvlJc w:val="left"/>
+      <w:pPr>
+        <w:tabs>
+          <w:tab w:val="num" w:pos="1440"/>
+        </w:tabs>
+        <w:ind w:left="1440" w:hanging="360"/>
+      </w:pPr>
+    </w:lvl>
+    <w:lvl w:ilvl="2" w:tentative="1">
+      <w:start w:val="1"/>
+      <w:numFmt w:val="decimal"/>
+      <w:lvlText w:val="%3."/>
+      <w:lvlJc w:val="left"/>
+      <w:pPr>
+        <w:tabs>
+          <w:tab w:val="num" w:pos="2160"/>
+        </w:tabs>
+        <w:ind w:left="2160" w:hanging="360"/>
+      </w:pPr>
+    </w:lvl>
+    <w:lvl w:ilvl="3" w:tentative="1">
+      <w:start w:val="1"/>
+      <w:numFmt w:val="decimal"/>
+      <w:lvlText w:val="%4."/>
+      <w:lvlJc w:val="left"/>
+      <w:pPr>
+        <w:tabs>
+          <w:tab w:val="num" w:pos="2880"/>
+        </w:tabs>
+        <w:ind w:left="2880" w:hanging="360"/>
+      </w:pPr>
+    </w:lvl>
+    <w:lvl w:ilvl="4" w:tentative="1">
+      <w:start w:val="1"/>
+      <w:numFmt w:val="decimal"/>
+      <w:lvlText w:val="%5."/>
+      <w:lvlJc w:val="left"/>
+      <w:pPr>
+        <w:tabs>
+          <w:tab w:val="num" w:pos="3600"/>
+        </w:tabs>
+        <w:ind w:left="3600" w:hanging="360"/>
+      </w:pPr>
+    </w:lvl>
+    <w:lvl w:ilvl="5" w:tentative="1">
+      <w:start w:val="1"/>
+      <w:numFmt w:val="decimal"/>
+      <w:lvlText w:val="%6."/>
+      <w:lvlJc w:val="left"/>
+      <w:pPr>
+        <w:tabs>
+          <w:tab w:val="num" w:pos="4320"/>
+        </w:tabs>
+        <w:ind w:left="4320" w:hanging="360"/>
+      </w:pPr>
+    </w:lvl>
+    <w:lvl w:ilvl="6" w:tentative="1">
+      <w:start w:val="1"/>
+      <w:numFmt w:val="decimal"/>
+      <w:lvlText w:val="%7."/>
+      <w:lvlJc w:val="left"/>
+      <w:pPr>
+        <w:tabs>
+          <w:tab w:val="num" w:pos="5040"/>
+        </w:tabs>
+        <w:ind w:left="5040" w:hanging="360"/>
+      </w:pPr>
+    </w:lvl>
+    <w:lvl w:ilvl="7" w:tentative="1">
+      <w:start w:val="1"/>
+      <w:numFmt w:val="decimal"/>
+      <w:lvlText w:val="%8."/>
+      <w:lvlJc w:val="left"/>
+      <w:pPr>
+        <w:tabs>
+          <w:tab w:val="num" w:pos="5760"/>
+        </w:tabs>
+        <w:ind w:left="5760" w:hanging="360"/>
+      </w:pPr>
+    </w:lvl>
+    <w:lvl w:ilvl="8" w:tentative="1">
+      <w:start w:val="1"/>
+      <w:numFmt w:val="decimal"/>
+      <w:lvlText w:val="%9."/>
+      <w:lvlJc w:val="left"/>
+      <w:pPr>
+        <w:tabs>
+          <w:tab w:val="num" w:pos="6480"/>
+        </w:tabs>
+        <w:ind w:left="6480" w:hanging="360"/>
+      </w:pPr>
+    </w:lvl>
+  </w:abstractNum>
+  <w:abstractNum w:abstractNumId="17" w15:restartNumberingAfterBreak="0">
+    <w:nsid w:val="6C15415A"/>
+    <w:multiLevelType w:val="multilevel"/>
+    <w:tmpl w:val="C4B25EC2"/>
+    <w:lvl w:ilvl="0">
+      <w:start w:val="1"/>
+      <w:numFmt w:val="bullet"/>
+      <w:lvlText w:val=""/>
+      <w:lvlJc w:val="left"/>
+      <w:pPr>
+        <w:tabs>
+          <w:tab w:val="num" w:pos="720"/>
+        </w:tabs>
+        <w:ind w:left="720" w:hanging="360"/>
+      </w:pPr>
+      <w:rPr>
+        <w:rFonts w:ascii="Symbol" w:hAnsi="Symbol" w:hint="default"/>
+        <w:sz w:val="20"/>
+      </w:rPr>
+    </w:lvl>
+    <w:lvl w:ilvl="1" w:tentative="1">
+      <w:start w:val="1"/>
+      <w:numFmt w:val="bullet"/>
+      <w:lvlText w:val="o"/>
+      <w:lvlJc w:val="left"/>
+      <w:pPr>
+        <w:tabs>
+          <w:tab w:val="num" w:pos="1440"/>
+        </w:tabs>
+        <w:ind w:left="1440" w:hanging="360"/>
+      </w:pPr>
+      <w:rPr>
+        <w:rFonts w:ascii="Courier New" w:hAnsi="Courier New" w:hint="default"/>
+        <w:sz w:val="20"/>
+      </w:rPr>
+    </w:lvl>
+    <w:lvl w:ilvl="2" w:tentative="1">
+      <w:start w:val="1"/>
+      <w:numFmt w:val="bullet"/>
+      <w:lvlText w:val=""/>
+      <w:lvlJc w:val="left"/>
+      <w:pPr>
+        <w:tabs>
+          <w:tab w:val="num" w:pos="2160"/>
+        </w:tabs>
+        <w:ind w:left="2160" w:hanging="360"/>
+      </w:pPr>
+      <w:rPr>
+        <w:rFonts w:ascii="Wingdings" w:hAnsi="Wingdings" w:hint="default"/>
+        <w:sz w:val="20"/>
+      </w:rPr>
+    </w:lvl>
+    <w:lvl w:ilvl="3" w:tentative="1">
+      <w:start w:val="1"/>
+      <w:numFmt w:val="bullet"/>
+      <w:lvlText w:val=""/>
+      <w:lvlJc w:val="left"/>
+      <w:pPr>
+        <w:tabs>
+          <w:tab w:val="num" w:pos="2880"/>
+        </w:tabs>
+        <w:ind w:left="2880" w:hanging="360"/>
+      </w:pPr>
+      <w:rPr>
+        <w:rFonts w:ascii="Wingdings" w:hAnsi="Wingdings" w:hint="default"/>
+        <w:sz w:val="20"/>
+      </w:rPr>
+    </w:lvl>
+    <w:lvl w:ilvl="4" w:tentative="1">
+      <w:start w:val="1"/>
+      <w:numFmt w:val="bullet"/>
+      <w:lvlText w:val=""/>
+      <w:lvlJc w:val="left"/>
+      <w:pPr>
+        <w:tabs>
+          <w:tab w:val="num" w:pos="3600"/>
+        </w:tabs>
+        <w:ind w:left="3600" w:hanging="360"/>
+      </w:pPr>
+      <w:rPr>
+        <w:rFonts w:ascii="Wingdings" w:hAnsi="Wingdings" w:hint="default"/>
+        <w:sz w:val="20"/>
+      </w:rPr>
+    </w:lvl>
+    <w:lvl w:ilvl="5" w:tentative="1">
+      <w:start w:val="1"/>
+      <w:numFmt w:val="bullet"/>
+      <w:lvlText w:val=""/>
+      <w:lvlJc w:val="left"/>
+      <w:pPr>
+        <w:tabs>
+          <w:tab w:val="num" w:pos="4320"/>
+        </w:tabs>
+        <w:ind w:left="4320" w:hanging="360"/>
+      </w:pPr>
+      <w:rPr>
+        <w:rFonts w:ascii="Wingdings" w:hAnsi="Wingdings" w:hint="default"/>
+        <w:sz w:val="20"/>
+      </w:rPr>
+    </w:lvl>
+    <w:lvl w:ilvl="6" w:tentative="1">
+      <w:start w:val="1"/>
+      <w:numFmt w:val="bullet"/>
+      <w:lvlText w:val=""/>
+      <w:lvlJc w:val="left"/>
+      <w:pPr>
+        <w:tabs>
+          <w:tab w:val="num" w:pos="5040"/>
+        </w:tabs>
+        <w:ind w:left="5040" w:hanging="360"/>
+      </w:pPr>
+      <w:rPr>
+        <w:rFonts w:ascii="Wingdings" w:hAnsi="Wingdings" w:hint="default"/>
+        <w:sz w:val="20"/>
+      </w:rPr>
+    </w:lvl>
+    <w:lvl w:ilvl="7" w:tentative="1">
+      <w:start w:val="1"/>
+      <w:numFmt w:val="bullet"/>
+      <w:lvlText w:val=""/>
+      <w:lvlJc w:val="left"/>
+      <w:pPr>
+        <w:tabs>
+          <w:tab w:val="num" w:pos="5760"/>
+        </w:tabs>
+        <w:ind w:left="5760" w:hanging="360"/>
+      </w:pPr>
+      <w:rPr>
+        <w:rFonts w:ascii="Wingdings" w:hAnsi="Wingdings" w:hint="default"/>
+        <w:sz w:val="20"/>
+      </w:rPr>
+    </w:lvl>
+    <w:lvl w:ilvl="8" w:tentative="1">
+      <w:start w:val="1"/>
+      <w:numFmt w:val="bullet"/>
+      <w:lvlText w:val=""/>
+      <w:lvlJc w:val="left"/>
+      <w:pPr>
+        <w:tabs>
+          <w:tab w:val="num" w:pos="6480"/>
+        </w:tabs>
+        <w:ind w:left="6480" w:hanging="360"/>
+      </w:pPr>
+      <w:rPr>
+        <w:rFonts w:ascii="Wingdings" w:hAnsi="Wingdings" w:hint="default"/>
+        <w:sz w:val="20"/>
+      </w:rPr>
+    </w:lvl>
+  </w:abstractNum>
   <w:num w:numId="1" w16cid:durableId="560940567">
+    <w:abstractNumId w:val="5"/>
+  </w:num>
+  <w:num w:numId="2" w16cid:durableId="273564639">
+    <w:abstractNumId w:val="3"/>
+  </w:num>
+  <w:num w:numId="3" w16cid:durableId="115173927">
+    <w:abstractNumId w:val="13"/>
+  </w:num>
+  <w:num w:numId="4" w16cid:durableId="2089299399">
+    <w:abstractNumId w:val="9"/>
+  </w:num>
+  <w:num w:numId="5" w16cid:durableId="1938559832">
+    <w:abstractNumId w:val="4"/>
+  </w:num>
+  <w:num w:numId="6" w16cid:durableId="1070344596">
+    <w:abstractNumId w:val="12"/>
+  </w:num>
+  <w:num w:numId="7" w16cid:durableId="1994798136">
+    <w:abstractNumId w:val="15"/>
+  </w:num>
+  <w:num w:numId="8" w16cid:durableId="2139646545">
+    <w:abstractNumId w:val="6"/>
+  </w:num>
+  <w:num w:numId="9" w16cid:durableId="1776946138">
     <w:abstractNumId w:val="2"/>
   </w:num>
-  <w:num w:numId="2" w16cid:durableId="273564639">
+  <w:num w:numId="10" w16cid:durableId="2044137061">
+    <w:abstractNumId w:val="16"/>
+  </w:num>
+  <w:num w:numId="11" w16cid:durableId="765076276">
+    <w:abstractNumId w:val="8"/>
+  </w:num>
+  <w:num w:numId="12" w16cid:durableId="1115172305">
     <w:abstractNumId w:val="0"/>
   </w:num>
-  <w:num w:numId="3" w16cid:durableId="115173927">
-    <w:abstractNumId w:val="6"/>
+  <w:num w:numId="13" w16cid:durableId="1715233640">
+    <w:abstractNumId w:val="17"/>
   </w:num>
-  <w:num w:numId="4" w16cid:durableId="2089299399">
-    <w:abstractNumId w:val="4"/>
+  <w:num w:numId="14" w16cid:durableId="1332829354">
+    <w:abstractNumId w:val="14"/>
   </w:num>
-  <w:num w:numId="5" w16cid:durableId="1938559832">
+  <w:num w:numId="15" w16cid:durableId="491411492">
+    <w:abstractNumId w:val="11"/>
+  </w:num>
+  <w:num w:numId="16" w16cid:durableId="197207446">
     <w:abstractNumId w:val="1"/>
   </w:num>
-  <w:num w:numId="6" w16cid:durableId="1070344596">
-    <w:abstractNumId w:val="5"/>
-  </w:num>
-  <w:num w:numId="7" w16cid:durableId="1994798136">
+  <w:num w:numId="17" w16cid:durableId="1635719173">
     <w:abstractNumId w:val="7"/>
   </w:num>
-  <w:num w:numId="8" w16cid:durableId="2139646545">
-    <w:abstractNumId w:val="3"/>
+  <w:num w:numId="18" w16cid:durableId="298533535">
+    <w:abstractNumId w:val="10"/>
   </w:num>
 </w:numbering>
 </file>
@@ -3572,6 +6138,7 @@
   <w:style w:type="character" w:default="1" w:styleId="DefaultParagraphFont">
     <w:name w:val="Default Paragraph Font"/>
     <w:uiPriority w:val="1"/>
+    <w:semiHidden/>
     <w:unhideWhenUsed/>
   </w:style>
   <w:style w:type="table" w:default="1" w:styleId="TableNormal">
@@ -3894,6 +6461,22 @@
       <w:spacing w:after="0" w:line="240" w:lineRule="auto"/>
     </w:pPr>
   </w:style>
+  <w:style w:type="paragraph" w:customStyle="1" w:styleId="msonormal0">
+    <w:name w:val="msonormal"/>
+    <w:basedOn w:val="Normal"/>
+    <w:rsid w:val="000D7E95"/>
+    <w:pPr>
+      <w:spacing w:before="100" w:beforeAutospacing="1" w:after="100" w:afterAutospacing="1" w:line="240" w:lineRule="auto"/>
+    </w:pPr>
+    <w:rPr>
+      <w:rFonts w:ascii="Times New Roman" w:eastAsia="Times New Roman" w:hAnsi="Times New Roman" w:cs="Times New Roman"/>
+      <w:kern w:val="0"/>
+      <w:sz w:val="24"/>
+      <w:szCs w:val="24"/>
+      <w:lang w:eastAsia="en-IN"/>
+      <w14:ligatures w14:val="none"/>
+    </w:rPr>
+  </w:style>
 </w:styles>
 </file>
 

</xml_diff>